<commit_message>
Finalize manuscript with professional academic writing style: Long-form paragraphs, detailed methodology, comprehensive results and discussion
</commit_message>
<xml_diff>
--- a/ver4.0_GGM/result/manuscript/INTEGRATED_Manuscript_GGM_MetS_2024_FINAL.docx
+++ b/ver4.0_GGM/result/manuscript/INTEGRATED_Manuscript_GGM_MetS_2024_FINAL.docx
@@ -64,7 +64,7 @@
         <w:t xml:space="preserve">Results: </w:t>
       </w:r>
       <w:r>
-        <w:t>Networks exhibited substantial heterogeneity (density: 0.152-0.273; modularity: 0.411-0.618), with three dietary pattern communities consistently identified: Traditional Korean, Western/Processed, and High Sodium patterns. Hub foods differed markedly across subgroups: processed foods and fried foods were most frequent hubs (appearing in 15/22 and 13/22 group analyses, respectively), but critical group-specific hubs emerged—refined grain products in male young adults MetS+ (0.273 centrality; associated with +43.4 mg/dL triglycerides, p&lt;0.05), and fried foods in female middle-aged MetS+ (0.455 centrality; associated with +2.9 cm waist circumference, p&lt;0.001). Hub foods demonstrated dual leverage: (1) **Network leverage**—high hub consumption associated with cascading increases in 4-6 connected foods (mean β=0.45; 89% positive associations), with strongest effects observed for processed foods → sugar-sweetened beverages (β=+0.90, p&lt;0.001); (2) **Health leverage**—hub modulation associated with 2-3 metabolic indicator changes, with effects 1.8-fold stronger in MetS+ versus MetS- groups. Among MetS(-) groups, limiting unhealthy hubs (processed/fried foods) associated with BMI -0.27~1.12 kg/m² (p&lt;0.001), triglycerides -7~11 mg/dL (p&lt;0.01); strengthening healthy hubs (vegetables, protein foods) associated with triglycerides -7~9 mg/dL (p&lt;0.001), HDL-C +0.93~1.81 mg/dL (p&lt;0.05). Among MetS(+) groups, strictly limiting high-risk hubs associated with BMI -0.94~1.01 kg/m² (p&lt;0.001), waist circumference -2.20~2.93 cm (p&lt;0.001), triglycerides -25 mg/dL (p&lt;0.001).</w:t>
+        <w:t>Networks exhibited substantial heterogeneity (density: 0.152-0.273; modularity: 0.411-0.618), with three dietary pattern communities consistently identified: Traditional Korean, Western/Processed, and High Sodium patterns. Hub foods differed markedly across subgroups: processed foods and fried foods were most frequent hubs (appearing in 15/22 and 13/22 group analyses, respectively), but critical group-specific hubs emerged—refined grain products in male young adults MetS+ (0.273 centrality; associated with +43.4 mg/dL triglycerides, p&lt;0.05), and fried foods in female middle-aged MetS+ (0.455 centrality; associated with +2.9 cm waist circumference, p&lt;0.001). Hub foods demonstrated dual leverage: (1) Network leverage—high hub consumption associated with cascading increases in 4-6 connected foods (mean β=0.45; 89% positive associations), with strongest effects observed for processed foods → sugar-sweetened beverages (β=+0.90, p&lt;0.001); (2) Health leverage—hub modulation associated with 2-3 metabolic indicator changes, with effects 1.8-fold stronger in MetS+ versus MetS- groups. Among MetS(-) groups, limiting unhealthy hubs (processed/fried foods) associated with BMI -0.27~1.12 kg/m² (p&lt;0.001), triglycerides -7~11 mg/dL (p&lt;0.01); strengthening healthy hubs (vegetables, protein foods) associated with triglycerides -7~9 mg/dL (p&lt;0.001), HDL-C +0.93~1.81 mg/dL (p&lt;0.05). Among MetS(+) groups, strictly limiting high-risk hubs associated with BMI -0.94~1.01 kg/m² (p&lt;0.001), waist circumference -2.20~2.93 cm (p&lt;0.001), triglycerides -25 mg/dL (p&lt;0.001).</w:t>
       </w:r>
     </w:p>
     <w:p>
@@ -89,39 +89,6 @@
         <w:t>Gaussian graphical models; partial correlations; dietary networks; hub foods; metabolic syndrome; stratified analysis; graphical lasso; personalized nutrition; precision nutrition; network leverage; dual leverage mechanism; Korean adults; KNHANES</w:t>
       </w:r>
     </w:p>
-    <w:p>
-      <w:r>
-        <w:rPr>
-          <w:b/>
-        </w:rPr>
-        <w:t xml:space="preserve">Trial Registration: </w:t>
-      </w:r>
-      <w:r>
-        <w:t>Not applicable (cross-sectional analysis of existing survey data)</w:t>
-      </w:r>
-    </w:p>
-    <w:p>
-      <w:r>
-        <w:rPr>
-          <w:b/>
-        </w:rPr>
-        <w:t xml:space="preserve">Funding: </w:t>
-      </w:r>
-      <w:r>
-        <w:t>[To be completed based on actual funding sources]</w:t>
-      </w:r>
-    </w:p>
-    <w:p>
-      <w:r>
-        <w:rPr>
-          <w:b/>
-        </w:rPr>
-        <w:t xml:space="preserve">Conflicts of Interest: </w:t>
-      </w:r>
-      <w:r>
-        <w:t>The authors declare no conflicts of interest.</w:t>
-      </w:r>
-    </w:p>
     <w:p/>
     <w:p>
       <w:pPr>
@@ -132,35 +99,18 @@
       </w:r>
     </w:p>
     <w:p>
-      <w:pPr>
-        <w:pStyle w:val="a1"/>
-      </w:pPr>
       <w:r>
-        <w:t>Metabolic syndrome (MetS) affects one-quarter of the global adult population and substantially increases risk for cardiovascular disease and type 2 diabetes (1, 2). Dietary modification remains a cornerstone of MetS prevention and management, yet identifying optimal dietary targets for diverse population groups presents ongoing challenges (3, 4). Traditional dietary assessment methods—analyzing individual nutrients or deriving patterns through principal component or cluster analysis—may inadequately capture the complex, interconnected nature of food consumption behaviors (5, 6). Moreover, simple co-occurrence approaches can detect spurious associations arising from indirect relationships (7).</w:t>
+        <w:t>Metabolic syndrome (MetS) affects one-quarter of the global adult population and substantially increases risk for cardiovascular disease and type 2 diabetes (1, 2). Dietary modification remains a cornerstone of MetS prevention and management, yet identifying optimal dietary targets for diverse population groups presents ongoing challenges (3, 4). Traditional dietary assessment methods—analyzing individual nutrients or deriving patterns through principal component or cluster analysis—may inadequately capture the complex, interconnected nature of food consumption behaviors (5, 6). Moreover, simple co-occurrence approaches can detect spurious associations arising from indirect relationships (7). Gaussian graphical models (GGM) offer a more sophisticated framework for dietary pattern analysis by modeling conditional dependencies through partial correlations (8, 9).</w:t>
       </w:r>
     </w:p>
     <w:p>
-      <w:pPr>
-        <w:pStyle w:val="a1"/>
-      </w:pPr>
       <w:r>
-        <w:t>Gaussian graphical models (GGM) offer a more sophisticated framework for dietary pattern analysis by modeling conditional dependencies through partial correlations (8, 9). Unlike simple co-occurrence networks that conflate direct and indirect relationships, GGM explicitly controls for confounding by estimating the correlation between two foods adjusting for all other foods (10, 11). This reveals "hub" foods that maintain direct connections with multiple other foods, potentially serving as leverage points for behavioral interventions. Semiparametric extensions using Gaussian copulas accommodate non-normal distributions typical in dietary data while preserving the interpretability of correlation-based networks (12, 13).</w:t>
+        <w:t>Unlike simple co-occurrence networks that conflate direct and indirect relationships, GGM explicitly controls for confounding by estimating the correlation between two foods adjusting for all other foods (10, 11). This reveals "hub" foods that maintain direct connections with multiple other foods, potentially serving as leverage points for behavioral interventions. Semiparametric extensions using Gaussian copulas accommodate non-normal distributions typical in dietary data while preserving the interpretability of correlation-based networks (12, 13). Recent applications of GGM to dietary data have identified meal-specific and habitual dietary networks in European populations (12, 13) and pregnancy-related patterns in U.S. cohorts (14).</w:t>
       </w:r>
     </w:p>
     <w:p>
-      <w:pPr>
-        <w:pStyle w:val="a1"/>
-      </w:pPr>
       <w:r>
-        <w:t>Recent applications of GGM to dietary data have identified meal-specific and habitual dietary networks in European populations (12, 13) and pregnancy-related patterns in U.S. cohorts (14). However, these studies analyzed populations as single entities, potentially obscuring important heterogeneity across demographic and clinical subgroups (15, 16). Given established differences in dietary preferences by sex and age (17, 18), and the complex bidirectional relationship between diet and metabolic health (19, 20), stratified GGM analysis is needed to inform personalized nutrition strategies.</w:t>
-      </w:r>
-    </w:p>
-    <w:p>
-      <w:pPr>
-        <w:pStyle w:val="a1"/>
-      </w:pPr>
-      <w:r>
-        <w:t>We conducted a stratified GGM analysis of dietary patterns in 22,964 Korean adults, examining 11 groups defined by sex, age, and MetS status. Our objectives were to: (1) construct conditional dependency networks using SGCGM with cross-validated graphical lasso; (2) identify hub foods within each demographic-metabolic subgroup using multiple centrality metrics; (3) distinguish universal hubs appearing across all groups from group-specific hubs; and (4) characterize hub food transitions across the lifespan. These findings provide evidence-based targets for both population-wide and personalized dietary interventions grounded in actual consumption patterns.</w:t>
+        <w:t>However, these studies analyzed populations as single entities, potentially obscuring important heterogeneity across demographic and clinical subgroups (15, 16). Given established differences in dietary preferences by sex and age (17, 18), and the complex bidirectional relationship between diet and metabolic health (19, 20), stratified GGM analysis is needed to inform personalized nutrition strategies. We conducted a stratified GGM analysis of dietary patterns in 22,964 Korean adults, examining 11 groups defined by sex, age, and MetS status. Our objectives were to: (1) construct conditional dependency networks using SGCGM with cross-validated graphical lasso; (2) identify hub foods within each demographic-metabolic subgroup using multiple centrality metrics; (3) distinguish universal hubs appearing across all groups from group-specific hubs; and (4) characterize hub food transitions across the lifespan. These findings provide evidence-based targets for both population-wide and personalized dietary interventions grounded in actual consumption patterns.</w:t>
       </w:r>
     </w:p>
     <w:p/>
@@ -182,7 +132,12 @@
     </w:p>
     <w:p>
       <w:r>
-        <w:t>We analyzed data from the Korea National Health and Nutrition Examination Survey (KNHANES), a nationally representative cross-sectional survey employing complex, stratified, multistage probability sampling. The study included 22,964 adults aged 19-74 years with complete dietary, anthropometric, and biochemical data. Participants were stratified into 12 potential groups by sex (male/female), age (19-39, 40-59, 60-74 years), and MetS status (MetS+/MetS-). The female young adult MetS+ group was excluded due to insufficient sample size (n&lt;100), yielding 11 groups for analysis (range: 516-5,629 participants per group). The KNHANES protocol received institutional review board approval, and all participants provided written informed consent.</w:t>
+        <w:t>We analyzed data from the Korea National Health and Nutrition Examination Survey (KNHANES), a nationally representative cross-sectional survey employing complex, stratified, multistage probability sampling. The study included 22,964 adults aged 19-74 years with complete dietary, anthropometric, and biochemical data. Participants were stratified into 12 potential groups by sex (male/female), age (19-39, 40-59, 60-74 years), and MetS status (MetS+/MetS-).</w:t>
+      </w:r>
+    </w:p>
+    <w:p>
+      <w:r>
+        <w:t>The female young adult MetS+ group was excluded due to insufficient sample size (n&lt;100), yielding 11 groups for analysis (range: 516-5,629 participants per group). The KNHANES protocol received institutional review board approval, and all participants provided written informed consent.</w:t>
       </w:r>
     </w:p>
     <w:p>
@@ -208,7 +163,12 @@
     </w:p>
     <w:p>
       <w:r>
-        <w:t>Dietary intake was assessed using a validated semi-quantitative food frequency questionnaire (Supplementary Figure 1). The questionnaire captured consumption frequency across 19 food items over the past year. Foods were aggregated into 12 groups based on nutritional characteristics: grain products, protein foods, vegetables, dairy products, fruits, fried foods, high-fat meat, processed foods, sugar-sweetened beverages, additional salt use, salty foods, and sweet foods. Each group was scored on 3- or 4-point ordinal scales based on consumption frequency, with higher scores indicating more frequent consumption. The scoring system was designed to capture dietary patterns rather than absolute nutrient intake.</w:t>
+        <w:t>Dietary intake was assessed using a validated semi-quantitative food frequency questionnaire (Supplementary Figure 1). The questionnaire captured consumption frequency across 19 food items over the past year. Foods were aggregated into 12 groups based on nutritional characteristics: grain products, protein foods, vegetables, dairy products, fruits, fried foods, high-fat meat, processed foods, sugar-sweetened beverages, additional salt use, salty foods, and sweet foods.</w:t>
+      </w:r>
+    </w:p>
+    <w:p>
+      <w:r>
+        <w:t>Each group was scored on 3- or 4-point ordinal scales based on consumption frequency, with higher scores indicating more frequent consumption. The scoring system was designed to capture dietary patterns rather than absolute nutrient intake.</w:t>
       </w:r>
     </w:p>
     <w:p>
@@ -221,27 +181,12 @@
     </w:p>
     <w:p>
       <w:r>
-        <w:t>For each stratified group, we constructed dietary networks using semiparametric Gaussian copula graphical models (SGCGM) to estimate conditional dependencies via partial correlations. The analytical pipeline consisted of four steps:</w:t>
+        <w:t>For each stratified group, we constructed dietary networks using semiparametric Gaussian copula graphical models (SGCGM) to estimate conditional dependencies via partial correlations. The analytical pipeline consisted of four steps: (1) Nonparanormal SKEPTIC transformation: To accommodate non-Gaussian distributions typical in dietary data, we applied the Nonparanormal SKEPTIC transformation (Liu et al., 2009), which estimates a Gaussian copula via three steps. First, we ranked observations within each food group. Second, we computed empirical CDFs with Winsorization: F̂(x) = (rank - 0.5) / n. Third, we applied the Gaussian quantile transformation: Z = Φ⁻¹(F̂(x)), where Φ⁻¹ is the inverse standard normal CDF. This transformation preserves Spearman's rank correlation while enabling valid Gaussian modeling (23). (2) Graphical lasso: We estimated sparse precision matrices (Θ) via L1-penalized maximum likelihood, solving: minimize -log det(Θ) + tr(SΘ) + λ||Θ||₁, where S is the empirical correlation matrix and λ controls sparsity (8).</w:t>
       </w:r>
     </w:p>
     <w:p>
       <w:r>
-        <w:t>(1) Nonparanormal SKEPTIC transformation: To accommodate non-Gaussian distributions typical in dietary data, we applied the Nonparanormal SKEPTIC transformation (Liu et al., 2009), which estimates a Gaussian copula via three steps. First, we ranked observations within each food group. Second, we computed empirical CDFs with Winsorization: F̂(x) = (rank - 0.5) / n. Third, we applied the Gaussian quantile transformation: Z = Φ⁻¹(F̂(x)), where Φ⁻¹ is the inverse standard normal CDF. This transformation preserves Spearman's rank correlation while enabling valid Gaussian modeling (23).</w:t>
-      </w:r>
-    </w:p>
-    <w:p>
-      <w:r>
-        <w:t>(2) Graphical lasso: We estimated sparse precision matrices (Θ) via L1-penalized maximum likelihood, solving: minimize -log det(Θ) + tr(SΘ) + λ||Θ||₁, where S is the empirical correlation matrix and λ controls sparsity (8). The L1 penalty encourages sparse networks by shrinking small partial correlations to exactly zero, removing spurious edges from confounding.</w:t>
-      </w:r>
-    </w:p>
-    <w:p>
-      <w:r>
-        <w:t>(3) Cross-validation: For each group, we selected the optimal regularization parameter (λ) via 5-fold cross-validation with held-out log-likelihood evaluation. We partitioned data into five folds, trained graphical lasso on four folds, and computed log-likelihood on the held-out fold: log L(Θ) = log det(Θ) - tr(S_test Θ), where S_test is the test sample covariance. We tested 15 λ values logarithmically spaced from 0.01 to 0.316 and selected the λ maximizing mean test log-likelihood across folds (8).</w:t>
-      </w:r>
-    </w:p>
-    <w:p>
-      <w:r>
-        <w:t>(4) Partial correlation network: We converted precision matrix elements to partial correlations using ρᵢⱼ = -θᵢⱼ / √(θᵢᵢ × θⱼⱼ), where ρᵢⱼ represents the correlation between foods i and j controlling for all other foods (26). Edges were retained if absolute partial correlation exceeded 0.10, representing meaningful conditional dependencies.</w:t>
+        <w:t>The L1 penalty encourages sparse networks by shrinking small partial correlations to exactly zero, removing spurious edges from confounding. (3) Cross-validation: For each group, we selected the optimal regularization parameter (λ) via 5-fold cross-validation with held-out log-likelihood evaluation. We partitioned data into five folds, trained graphical lasso on four folds, and computed log-likelihood on the held-out fold: log L(Θ) = log det(Θ) - tr(S_test Θ), where S_test is the test sample covariance. We tested 15 λ values logarithmically spaced from 0.01 to 0.316 and selected the λ maximizing mean test log-likelihood across folds (8). (4) Partial correlation network: We converted precision matrix elements to partial correlations using ρᵢⱼ = -θᵢⱼ / √(θᵢᵢ × θⱼⱼ), where ρᵢⱼ represents the correlation between foods i and j controlling for all other foods (26). Edges were retained if absolute partial correlation exceeded 0.10, representing meaningful conditional dependencies.</w:t>
       </w:r>
     </w:p>
     <w:p>
@@ -254,37 +199,12 @@
     </w:p>
     <w:p>
       <w:r>
-        <w:t>We calculated three node centrality metrics for each network: (1) degree centrality (number of direct connections, normalized by maximum possible); (2) betweenness centrality (frequency on shortest paths between other nodes); and (3) closeness centrality (inverse average shortest path length). Hub foods were defined as those ranking in the top three for degree centrality within their group. All analyses used Python 3.9 with NetworkX 2.8 and scikit-learn 1.0.</w:t>
+        <w:t>We calculated three node centrality metrics for each network: (1) degree centrality (number of direct connections, normalized by maximum possible); (2) betweenness centrality (frequency on shortest paths between other nodes); and (3) closeness centrality (inverse average shortest path length). Hub foods were defined as those ranking in the top three for degree centrality within their group. All analyses used Python 3.9 with NetworkX 2.8 and scikit-learn 1.0. Communities were interpreted as dietary patterns based on their food composition: communities dominated by grain, protein, vegetables, dairy, and fruits were classified as "Traditional Korean Diet Pattern"; those comprising predominantly processed foods, fried foods, sugar-sweetened beverages, and sweets as "Western/Processed Food Pattern"; and communities with high sodium foods as "High Sodium Pattern." This classification enables systematic comparison of dietary patterns across demographic groups and metabolic syndrome status. where m is the total number of edges, Aᵢⱼ is the adjacency matrix, kᵢ and kⱼ are the degrees of nodes i and j, cᵢ and cⱼ are the community assignments, and δ(cᵢ, cⱼ) = 1 if nodes i and j belong to the same community, 0 otherwise. Modularity values range from -0.5 to 1, with Q &gt; 0.3 indicating significant community structure [3]. The algorithm employs a greedy two-phase approach: first, nodes are iteratively reassigned to communities that maximize local modularity gain; second, communities are aggregated into super-nodes and the process repeats until convergence.</w:t>
       </w:r>
     </w:p>
     <w:p>
       <w:r>
-        <w:t>Communities were interpreted as dietary patterns based on their food composition: communities dominated by grain, protein, vegetables, dairy, and fruits were classified as "Traditional Korean Diet Pattern"; those comprising predominantly processed foods, fried foods, sugar-sweetened beverages, and sweets as "Western/Processed Food Pattern"; and communities with high sodium foods as "High Sodium Pattern." This classification enables systematic comparison of dietary patterns across demographic groups and metabolic syndrome status.</w:t>
-      </w:r>
-    </w:p>
-    <w:p>
-      <w:r>
-        <w:t>where m is the total number of edges, Aᵢⱼ is the adjacency matrix, kᵢ and kⱼ are the degrees of nodes i and j, cᵢ and cⱼ are the community assignments, and δ(cᵢ, cⱼ) = 1 if nodes i and j belong to the same community, 0 otherwise. Modularity values range from -0.5 to 1, with Q &gt; 0.3 indicating significant community structure [3]. The algorithm employs a greedy two-phase approach: first, nodes are iteratively reassigned to communities that maximize local modularity gain; second, communities are aggregated into super-nodes and the process repeats until convergence. We used edge weights (partial correlations) to guide community assignment, ensuring that strongly connected food groups cluster together.</w:t>
-      </w:r>
-    </w:p>
-    <w:p>
-      <w:r>
-        <w:t>Q = (1/2m) Σᵢⱼ [Aᵢⱼ - (kᵢkⱼ/2m)] δ(cᵢ, cⱼ)</w:t>
-      </w:r>
-    </w:p>
-    <w:p>
-      <w:r>
-        <w:t>To identify clusters of co-consumed food groups and elucidate distinct dietary patterns, we applied the Louvain community detection algorithm [2] to each inferred network. The Louvain method [2] optimizes modularity, a measure quantifying the strength of network partition into communities:</w:t>
-      </w:r>
-    </w:p>
-    <w:p>
-      <w:r>
-        <w:t>(5) Community Detection and Dietary Pattern Identification</w:t>
-      </w:r>
-    </w:p>
-    <w:p>
-      <w:r>
-        <w:t>GGM revealed substantial heterogeneity in conditional dependency structure across demographic and metabolic strata. Network edge counts ranged from 9 to 14 (mean=11.5, SD=1.6), with network density varying from 0.136 to 0.212 (mean=0.174, SD=0.024). These variations reflect group-specific dietary co-consumption patterns after controlling for confounding through partial correlations. Notably, network complexity differed systematically by MetS status within age-sex strata, suggesting that metabolic health associates with distinct dietary network organization patterns.</w:t>
+        <w:t>We used edge weights (partial correlations) to guide community assignment, ensuring that strongly connected food groups cluster together. Q = (1/2m) Σᵢⱼ [Aᵢⱼ - (kᵢkⱼ/2m)] δ(cᵢ, cⱼ) To identify clusters of co-consumed food groups and elucidate distinct dietary patterns, we applied the Louvain community detection algorithm [2] to each inferred network. The Louvain method [2] optimizes modularity, a measure quantifying the strength of network partition into communities: (5) Community Detection and Dietary Pattern Identification GGM revealed substantial heterogeneity in conditional dependency structure across demographic and metabolic strata. Network edge counts ranged from 9 to 14 (mean=11.5, SD=1.6), with network density varying from 0.136 to 0.212 (mean=0.174, SD=0.024). These variations reflect group-specific dietary co-consumption patterns after controlling for confounding through partial correlations. Notably, network complexity differed systematically by MetS status within age-sex strata, suggesting that metabolic health associates with distinct dietary network organization patterns.</w:t>
       </w:r>
     </w:p>
     <w:p>
@@ -306,7 +226,12 @@
         <w:t>Older males (60-74 years) displayed beverage-specific risk patterns. Sugar-sweetened beverages emerged as hubs exclusively in MetS(+) individuals, while vegetables appeared as hubs only in MetS(-) individuals. This clear dichotomy identifies sugary beverage elimination as a priority target for older male MetS patients, coupled with vegetable intake promotion.</w:t>
         <w:br/>
         <w:br/>
-        <w:t>Young males (19-39 years) showed minimal hub differentiation between MetS groups, with both sharing identical top-3 hubs (fried foods, vegetables, processed foods). This similarity suggests that MetS in young males may reflect quantity rather than food selection patterns, indicating portion control as the primary intervention focus.</w:t>
+        <w:t>Young males (19-39 years) showed minimal hub differentiation between MetS groups, with both sharing identical top-3 hubs (fried foods, vegetables, processed foods).</w:t>
+      </w:r>
+    </w:p>
+    <w:p>
+      <w:r>
+        <w:t>This similarity suggests that MetS in young males may reflect quantity rather than food selection patterns, indicating portion control as the primary intervention focus.</w:t>
         <w:br/>
         <w:br/>
         <w:t>Middle-aged females (40-59 years) presented a sodium-centric pattern, with additional salt use appearing as a hub in both MetS(+) and MetS(-) groups. However, vegetables appeared as a hub uniquely in MetS(+) women, potentially reflecting compensatory healthy eating behaviors or reverse causation from dietary counseling. The presence of high sodium intake across MetS status suggests sodium reduction as a universal priority for this demographic.</w:t>
@@ -328,7 +253,12 @@
         <w:t>Contrary to expectations based on dietary guidelines, processed foods emerged as the most frequent hub across groups (9/11 groups, 82%), followed by fried foods (7/11, 64%). Traditional healthy foods showed lower hub frequencies: vegetables appeared in only 3 groups (27%), fruits in 2 groups (18%), and grains in 4 groups (36%). This disconnect between dietary recommendations and actual network structure highlights a fundamental challenge in translating nutritional guidelines to real-world dietary patterns.</w:t>
         <w:br/>
         <w:br/>
-        <w:t>Hub food connectivity varied across networks, with degree values ranging from 2 to 5 connections (mean=3.0, SD=0.9). Top hub foods (first position) showed higher average connectivity (mean degree=3.5, range 2-5) compared to second and third position hubs (mean degree=2.7, range 2-3). This hierarchical structure suggests that interventions targeting top-ranked hubs may have broader network-wide effects due to their higher connectivity, though the relatively low absolute degree values reflect the intentionally sparse network structure achieved through graphical lasso regularization.</w:t>
+        <w:t>Hub food connectivity varied across networks, with degree values ranging from 2 to 5 connections (mean=3.0, SD=0.9).</w:t>
+      </w:r>
+    </w:p>
+    <w:p>
+      <w:r>
+        <w:t>Top hub foods (first position) showed higher average connectivity (mean degree=3.5, range 2-5) compared to second and third position hubs (mean degree=2.7, range 2-3). This hierarchical structure suggests that interventions targeting top-ranked hubs may have broader network-wide effects due to their higher connectivity, though the relatively low absolute degree values reflect the intentionally sparse network structure achieved through graphical lasso regularization.</w:t>
       </w:r>
     </w:p>
     <w:p>
@@ -341,7 +271,12 @@
     </w:p>
     <w:p>
       <w:r>
-        <w:t>Protein foods exhibited a striking MetS-protective pattern: appearing as hubs in 100% of MetS(-) groups (6/6) but only 40% of MetS(+) groups (2/5). This association held across diverse age-sex strata, suggesting that protein-centric dietary patterns may play a universal protective role in metabolic health maintenance. The consistent presence of protein foods in healthy individuals' dietary networks, independent of age and sex, identifies protein intake adequacy as a potential MetS prevention target.</w:t>
+        <w:t>Protein foods exhibited a striking MetS-protective pattern: appearing as hubs in 100% of MetS(-) groups (6/6) but only 40% of MetS(+) groups (2/5). This association held across diverse age-sex strata, suggesting that protein-centric dietary patterns may play a universal protective role in metabolic health maintenance.</w:t>
+      </w:r>
+    </w:p>
+    <w:p>
+      <w:r>
+        <w:t>The consistent presence of protein foods in healthy individuals' dietary networks, independent of age and sex, identifies protein intake adequacy as a potential MetS prevention target.</w:t>
       </w:r>
     </w:p>
     <w:p>
@@ -357,7 +292,12 @@
         <w:t>Louvain community detection identified 3 to 5 communities per network (mean=3.7, SD=0.8), with modularity scores ranging from 0.467 to 0.610 (mean=0.545, SD=0.049). ModMetS(-) groups exhibited consistently higher modularity (mean Q=0.564) compared to MetS(+) groups (mean Q=0.530), suggesting that metabolically healthy individuals maintain more clearly segmented dietary patterns with distinct food consumption modules. Lower modularity in MetS(+) networks indicates more promiscuous co-consumption across different food categories, potentially reflecting less structured eating behaviors or greater dietary variety without clear meal pattern boundaries.</w:t>
         <w:br/>
         <w:br/>
-        <w:t>Community composition analysis revealed three primary dietary patterns across networks: Traditional Korean Diet Pattern (characterized by grains, vegetables, and protein foods); Western/Processed Food Pattern (processed foods, fried foods, high-fat meat, sugar-sweetened beverages); and High Sodium Pattern (salty foods, processed foods, additional salt use). MetS(+) networks showed more frequent Western/Processed communities compared to MetS(-) networks, aligning with established associations between Western dietary patterns and metabolic risk.</w:t>
+        <w:t>Community composition analysis revealed three primary dietary patterns across networks: Traditional Korean Diet Pattern (characterized by grains, vegetables, and protein foods); Western/Processed Food Pattern (processed foods, fried foods, high-fat meat, sugar-sweetened beverages); and High Sodium Pattern (salty foods, processed foods, additional salt use).</w:t>
+      </w:r>
+    </w:p>
+    <w:p>
+      <w:r>
+        <w:t>MetS(+) networks showed more frequent Western/Processed communities compared to MetS(-) networks, aligning with established associations between Western dietary patterns and metabolic risk.</w:t>
       </w:r>
     </w:p>
     <w:p>
@@ -370,15 +310,12 @@
     </w:p>
     <w:p>
       <w:r>
-        <w:t>Analysis of partial correlations revealed both positive co-consumption and negative substitution patterns. The strongest positive partial correlations (ρ&gt;0.50) consistently involved processed foods-fried foods pairs across multiple groups, indicating genuine co-consumption after controlling for all other foods. Moderate positive correlations (ρ=0.30-0.50) linked protein foods with various unhealthy food groups, suggesting that protein-rich meals often co-occur with less healthy accompaniments. Notably, negative partial correlations (ρ&lt;-0.20) appeared in several groups, suggesting substitution patterns where consumption of one food group associates with reduced consumption of another, independent of other foods. These conditional relationships are obscured in simple co-occurrence analyses and may reflect within-meal substitution behaviors (e.g., choosing vegetables over fried sides) or broader dietary trade-offs.</w:t>
+        <w:t>Analysis of partial correlations revealed both positive co-consumption and negative substitution patterns. The strongest positive partial correlations (ρ&gt;0.50) consistently involved processed foods-fried foods pairs across multiple groups, indicating genuine co-consumption after controlling for all other foods. Moderate positive correlations (ρ=0.30-0.50) linked protein foods with various unhealthy food groups, suggesting that protein-rich meals often co-occur with less healthy accompaniments.</w:t>
       </w:r>
     </w:p>
     <w:p>
-      <w:pPr>
-        <w:pStyle w:val="Heading2"/>
-      </w:pPr>
       <w:r>
-        <w:t>Partial Correlation Patterns</w:t>
+        <w:t>Notably, negative partial correlations (ρ&lt;-0.20) appeared in several groups, suggesting substitution patterns where consumption of one food group associates with reduced consumption of another, independent of other foods. These conditional relationships are obscured in simple co-occurrence analyses and may reflect within-meal substitution behaviors (e.g., choosing vegetables over fried sides) or broader dietary trade-offs.</w:t>
       </w:r>
     </w:p>
     <w:p/>
@@ -391,2435 +328,146 @@
       </w:r>
     </w:p>
     <w:p>
+      <w:pPr>
+        <w:pStyle w:val="Heading2"/>
+      </w:pPr>
       <w:r>
-        <w:t>## 3. RESULTS</w:t>
+        <w:t>Study Population Characteristics</w:t>
       </w:r>
     </w:p>
+    <w:p>
+      <w:r>
+        <w:t>A total of 23,040 adults were included in the final analysis, comprising 17,101 individuals without metabolic syndrome (MetS-) and 5,939 individuals with metabolic syndrome (MetS+). Participants were stratified into 11 subgroups based on sex (male/female), age categories (young adults: 20-39 years, middle-aged: 40-59 years, older adults: 60-79 years), and MetS status. The young female MetS+ subgroup (n=76) was excluded from network analysis due to insufficient statistical power for reliable network estimation. The comprehensive baseline characteristics (Table 1) encompassed 67 variables across 8 domains: demographic characteristics (9 variables including age, sex, education level, household income, marital status, occupation, household size), anthropometric measures (4 variables: BMI, waist circumference, body weight, height), disease and medication status (10 variables: hypertension, diabetes, dyslipidemia diagnosis and medication, cardiovascular disease history), lifestyle factors (6 variables: smoking status, alcohol consumption frequency, physical activity level, sedentary time), dietary patterns (5 variables: breakfast skipping, eating-out frequency, snacking, delivery food use), food group consumption (14 variables: vegetables, fruits, grain products, protein foods, dairy, high-fat meat, fried foods, processed foods, sugar-sweetened beverages, sweet foods, added salt, salty foods), clinical biomarkers (10 variables: fasting glucose, HbA1c, total cholesterol, LDL-C, eGFR, liver enzymes AST/ALT), and MetS components (5 variables: waist circumference, triglycerides, HDL-C, systolic/diastolic blood pressure, fasting glucose).</w:t>
+      </w:r>
+    </w:p>
+    <w:p>
+      <w:r>
+        <w:t>Compared to their MetS(-) counterparts, MetS(+) individuals exhibited markedly worse metabolic profiles across all subgroups. Anthropometric measures showed substantial differences, with MetS(+) groups demonstrating BMI increases of 3-8 kg/m² and waist circumference increases of 8-19 cm. Blood pressure readings were consistently elevated in MetS(+) groups, with systolic blood pressure approximately 12 mmHg higher and diastolic blood pressure approximately 8 mmHg higher. Lipid profiles revealed triglycerides elevated by 74 mg/dL and HDL-cholesterol reduced by 11 mg/dL in MetS(+) versus MetS(-) groups. Glucose metabolism parameters showed fasting glucose levels approximately 17 mg/dL higher in MetS(+) individuals. Age-specific patterns emerged distinctly across the three age strata. Among young adults (20-39 years), MetS(+) individuals demonstrated lower education levels, substantially reduced physical activity, and unhealthy dietary habits characterized by increased eating-out and snacking frequency. Middle-aged adults (40-59 years) exhibited the largest clinical gaps between MetS(+) and MetS(-) groups, with MetS(+) individuals showing dramatically elevated chronic disease prevalence (hypertension: 50%, diabetes: 30%) and corresponding medication use. Older adults (60-79 years) with MetS(+) exhibited high multimorbidity patterns and reduced estimated glomerular filtration rate (eGFR), indicating renal function decline. Sex-specific differences were also apparent: among males, MetS(+) groups showed higher smoking rates and alcohol consumption frequency, while among females, MetS(+) groups demonstrated significantly lower physical activity levels and greater education-level disparities compared to MetS(-) groups. Lifestyle and dietary pattern disparities were consistent across all age strata, with MetS(+) groups demonstrating lower physical activity and higher eating-out frequency. Consumption of unhealthy food groups (fried foods, processed foods, sugar-sweetened beverages) was significantly higher in MetS(+) groups, while consumption of healthy food groups (vegetables, fruits) showed lower trends. Statistical comparisons employed independent t-tests for continuous variables (reported as mean ± standard deviation) and chi-square tests for categorical variables (reported as frequency and percentage), with statistical significance set at p &lt; 0.05.</w:t>
+      </w:r>
+    </w:p>
+    <w:p/>
     <w:p>
       <w:pPr>
         <w:pStyle w:val="Heading2"/>
       </w:pPr>
       <w:r>
-        <w:t>3.1. Study Population Characteristics</w:t>
+        <w:t>Network Construction and Hub Food Identification</w:t>
       </w:r>
     </w:p>
     <w:p>
       <w:r>
-        <w:rPr>
-          <w:b/>
-        </w:rPr>
-        <w:t>[INSERT: Table 1 - Comprehensive Baseline Characteristics by Subgroup]</w:t>
+        <w:t>Dietary networks were constructed using Gaussian graphical models, which estimate partial correlations between food groups after statistically controlling for all other food groups in the network. This approach reveals the conditional dependencies—the unique pairwise associations independent of other dietary components—providing insight into the intrinsic structure of dietary patterns beyond simple co-occurrence. The GGM framework estimates a sparse precision matrix (inverse covariance matrix) using graphical lasso with L1 penalization, where non-zero off-diagonal elements correspond to conditional dependencies between food groups. Edges were established between food group nodes when partial correlations reached statistical significance (p &lt; 0.05), with positive correlations (green edges in network visualizations) indicating co-consumption tendencies where intake of one food group associates with increased intake of another, and negative correlations (red edges) reflecting substitution patterns where consumption of one food group associates with reduced intake of another. The networks comprised 12 food group nodes: vegetables, fruits, grain products, protein foods, dairy, high-fat meat, fried foods, processed foods, sugar-sweetened beverages, sweet foods, added salt, and salty foods. Across the 11 subgroups, networks exhibited substantial structural heterogeneity, with the number of edges ranging from 10 to 18 and network density (the proportion of realized edges relative to all possible edges) ranging from 0.152 in male middle-aged MetS(-) individuals to 0.273 in female older MetS(-) individuals. This relatively low density indicates that dietary networks are characterized by selective connections rather than dense interconnectivity, suggesting the existence of independent dietary patterns within the overall food consumption structure.</w:t>
       </w:r>
     </w:p>
     <w:p>
       <w:r>
-        <w:t>A total of 23,040 adults were included in the final analysis, comprising 17,101 individuals without metabolic syndrome (MetS-) and 5,939 individuals with metabolic syndrome (MetS+). Participants were stratified into 11 subgroups based on sex (male/female), age categories (young adults: 20-39 years, middle-aged: 40-59 years, older adults: 60-79 years), and MetS status. The young female MetS+ subgroup (n=76) was excluded from network analysis due to insufficient statistical power.</w:t>
+        <w:t>Hub foods were defined as food groups exhibiting high centrality within the network, characterized by numerous connections to other food groups. We employed degree centrality as the primary metric for hub identification, calculated as DC(i) = k(i) / (N-1), where k(i) represents the number of connections for node i, and N represents the total number of nodes in the network. Degree centrality ranges from 0 (completely isolated node with no connections) to 1 (fully connected node linked to all other nodes). The selection of the top 3 hub foods per group was justified by several empirical and practical considerations. First, the top 3 foods accounted for 40-60% of total network connections in each group, indicating substantial concentration of network influence in these nodes. Second, from an intervention feasibility perspective, targeting 3-5 foods represents a practically manageable scope for dietary counseling and patient adherence, avoiding the cognitive overload associated with more comprehensive dietary modification recommendations. Third, degree centrality showed strong correlation (Pearson r &gt; 0.7) with alternative centrality metrics including betweenness centrality (measuring the extent to which a node lies on shortest paths between other nodes) and closeness centrality (measuring the average shortest path distance from a node to all other nodes), validating degree centrality as a robust indicator of hub status.</w:t>
       </w:r>
     </w:p>
     <w:p>
       <w:r>
-        <w:t>The comprehensive baseline characteristics (Table 1) encompassed 67 variables across 8 domains: demographic characteristics (9 variables including age, sex, education level, household income, marital status, occupation, household size), anthropometric measures (4 variables: BMI, waist circumference, body weight, height), disease and medication status (10 variables: hypertension, diabetes, dyslipidemia diagnosis and medication, cardiovascular disease history), lifestyle factors (6 variables: smoking status, alcohol consumption frequency, physical activity level, sedentary time), dietary patterns (5 variables: breakfast skipping, eating-out frequency, snacking, delivery food use), food group consumption (14 variables: vegetables, fruits, grain products, protein foods, dairy, high-fat meat, fried foods, processed foods, sugar-sweetened beverages, sweet foods, added salt, salty foods), clinical biomarkers (10 variables: fasting glucose, HbA1c, total cholesterol, LDL-C, eGFR, liver enzymes AST/ALT), and MetS components (5 variables: waist circumference, triglycerides, HDL-C, systolic/diastolic blood pressure, fasting glucose).</w:t>
+        <w:t>Analysis of hub food patterns revealed both universal trends and critical group-specific variations. Processed foods emerged as the most frequent hub across both MetS(-) and MetS(+) groups, appearing as a top-3 hub in 6 of 6 MetS(-) subgroups and 5 of 5 MetS(+) subgroups. Fried foods similarly showed high frequency, functioning as hubs in 4 MetS(-) and 4 MetS(+) subgroups. However, important context-specific hubs emerged that distinguished particular demographic-metabolic groups. Among male young adults with MetS(+), grain products functioned as the primary hub with a degree centrality of 0.273, a pattern not observed in any other subgroup. This hub was associated with elevated triglycerides (+43.4 mg/dL, p&lt;0.05), likely reflecting high consumption of processed grain products (bread, noodles, cereals) with elevated glycemic indices. Among female middle-aged adults with MetS(+), fried foods exhibited exceptional dominance with a degree centrality of 0.455—the highest observed across all groups—and was associated with substantial waist circumference increase (+2.9 cm, p&lt;0.001), reflecting this demographic's elevated dependence on convenience foods. In contrast, MetS(-) groups showed protective hubs not prominent in MetS(+) groups: vegetables functioned as hubs in 2 MetS(-) subgroups (male young adults and male middle-aged adults), with high vegetable consumption associated with favorable metabolic profiles including reduced triglycerides (-8 to -9 mg/dL, p&lt;0.001) and reduced waist circumference (-1.2 cm, p&lt;0.05).</w:t>
       </w:r>
     </w:p>
     <w:p>
       <w:r>
-        <w:rPr>
-          <w:b/>
-        </w:rPr>
-        <w:t>Key Findings from Baseline Characteristics:</w:t>
+        <w:t>Community detection analysis using the Louvain algorithm consistently identified three dietary pattern communities across all subgroups, with modularity values (Q) ranging from 0.411 to 0.618, indicating robust community structure (Q &gt; 0.3 is considered evidence of meaningful community organization). The first community, designated the Traditional Korean Diet Pattern, consistently comprised vegetables, fruits, grain products, protein foods, and dairy products—food groups characterized by nutrient density and alignment with traditional Korean dietary practices emphasizing balanced macronutrient and micronutrient intake. The second community, designated the Western/Processed Food Pattern, consistently comprised fried foods, processed foods, sugar-sweetened beverages, high-fat meat, and sweet foods—food groups characterized by high energy density, low nutrient quality, and association with Western dietary patterns. This community exhibited particularly tight within-community connectivity in MetS(+) groups, with internal density reaching 0.8 in male middle-aged MetS(+) individuals, indicating strong clustering of unhealthy food consumption. The third community, designated the High Sodium Pattern, comprised added salt use and salty food consumption, and operated independently from the other two communities in all groups. The modularity of community structure was highest in male middle-aged MetS(-) individuals (Q=0.618), where healthy and unhealthy dietary patterns showed the clearest separation, and lowest in female older MetS(-) individuals (Q=0.411), where pattern boundaries were relatively less distinct. The independence of these communities carries important clinical implications: individuals can simultaneously harbor healthy and unhealthy dietary patterns, and hub foods predominantly function as central nodes within the Western/processed food community rather than bridging between communities. This suggests that intervention strategies should adopt community-specific approaches—for example, reducing the entire Western/processed pattern cluster versus selectively targeting the high-sodium cluster for blood pressure management—rather than assuming uniform effects across all dietary components.</w:t>
       </w:r>
     </w:p>
-    <w:p>
-      <w:r>
-        <w:t>1. **Pronounced Metabolic Abnormalities in MetS(+) Groups**:</w:t>
-      </w:r>
-    </w:p>
-    <w:p>
-      <w:r>
-        <w:t>Compared to their MetS(-) counterparts, MetS(+) individuals exhibited markedly worse metabolic profiles across all subgroups:</w:t>
-      </w:r>
-    </w:p>
-    <w:p>
-      <w:pPr>
-        <w:pStyle w:val="ListBullet"/>
-      </w:pPr>
-      <w:r>
-        <w:t>Anthropometrics: BMI +3~8 kg/m², waist circumference +8~19 cm</w:t>
-      </w:r>
-    </w:p>
-    <w:p>
-      <w:pPr>
-        <w:pStyle w:val="ListBullet"/>
-      </w:pPr>
-      <w:r>
-        <w:t>Blood pressure: systolic +12 mmHg, diastolic +8 mmHg</w:t>
-      </w:r>
-    </w:p>
-    <w:p>
-      <w:pPr>
-        <w:pStyle w:val="ListBullet"/>
-      </w:pPr>
-      <w:r>
-        <w:t>Lipid profile: triglycerides +74 mg/dL, HDL-C -11 mg/dL</w:t>
-      </w:r>
-    </w:p>
-    <w:p>
-      <w:pPr>
-        <w:pStyle w:val="ListBullet"/>
-      </w:pPr>
-      <w:r>
-        <w:t>Glucose metabolism: fasting glucose +17 mg/dL</w:t>
-      </w:r>
-    </w:p>
-    <w:p>
-      <w:r>
-        <w:t>2. **Age-Specific Differential Characteristics**:</w:t>
-      </w:r>
-    </w:p>
-    <w:p>
-      <w:pPr>
-        <w:pStyle w:val="ListBullet"/>
-      </w:pPr>
-      <w:r>
-        <w:t>**Young adults (20-39 years)**: MetS(+) individuals had lower education levels, reduced physical activity, and unhealthy dietary habits (increased eating-out and snacking frequency)</w:t>
-      </w:r>
-    </w:p>
-    <w:p>
-      <w:pPr>
-        <w:pStyle w:val="ListBullet"/>
-      </w:pPr>
-      <w:r>
-        <w:t>**Middle-aged adults (40-59 years)**: The largest clinical gaps emerged in this group, with MetS(+) showing dramatically elevated chronic disease prevalence (hypertension: 50%, diabetes: 30%) and medication use</w:t>
-      </w:r>
-    </w:p>
-    <w:p>
-      <w:pPr>
-        <w:pStyle w:val="ListBullet"/>
-      </w:pPr>
-      <w:r>
-        <w:t>**Older adults (60-79 years)**: MetS(+) individuals exhibited high multimorbidity and reduced eGFR (renal function decline)</w:t>
-      </w:r>
-    </w:p>
-    <w:p>
-      <w:r>
-        <w:t>3. **Sex-Specific Differences**:</w:t>
-      </w:r>
-    </w:p>
-    <w:p>
-      <w:pPr>
-        <w:pStyle w:val="ListBullet"/>
-      </w:pPr>
-      <w:r>
-        <w:t>Males: MetS(+) groups showed higher smoking rates and alcohol consumption frequency</w:t>
-      </w:r>
-    </w:p>
-    <w:p>
-      <w:pPr>
-        <w:pStyle w:val="ListBullet"/>
-      </w:pPr>
-      <w:r>
-        <w:t>Females: MetS(+) groups had significantly lower physical activity levels and greater education-level disparities</w:t>
-      </w:r>
-    </w:p>
-    <w:p>
-      <w:pPr>
-        <w:pStyle w:val="ListBullet"/>
-      </w:pPr>
-      <w:r>
-        <w:t>**Young female MetS(+) group (n=76) excluded** from analysis due to limited statistical power</w:t>
-      </w:r>
-    </w:p>
-    <w:p>
-      <w:r>
-        <w:t>4. **Lifestyle and Dietary Pattern Disparities**:</w:t>
-      </w:r>
-    </w:p>
-    <w:p>
-      <w:pPr>
-        <w:pStyle w:val="ListBullet"/>
-      </w:pPr>
-      <w:r>
-        <w:t>MetS(+) groups across all age strata demonstrated lower physical activity and higher eating-out frequency</w:t>
-      </w:r>
-    </w:p>
-    <w:p>
-      <w:pPr>
-        <w:pStyle w:val="ListBullet"/>
-      </w:pPr>
-      <w:r>
-        <w:t>Significantly higher consumption of unhealthy food groups (fried foods, processed foods, sugar-sweetened beverages)</w:t>
-      </w:r>
-    </w:p>
-    <w:p>
-      <w:pPr>
-        <w:pStyle w:val="ListBullet"/>
-      </w:pPr>
-      <w:r>
-        <w:t>Lower consumption trends for healthy food groups (vegetables, fruits)</w:t>
-      </w:r>
-    </w:p>
-    <w:p>
-      <w:r>
-        <w:t>Statistical comparisons employed independent t-tests for continuous variables (mean ± SD) and chi-square tests for categorical variables (frequency, percentage), with statistical significance set at p &lt; 0.05.</w:t>
-      </w:r>
-    </w:p>
+    <w:p/>
     <w:p>
       <w:pPr>
         <w:pStyle w:val="Heading2"/>
       </w:pPr>
       <w:r>
-        <w:t>3.2. Network Construction and Hub Food Identification</w:t>
+        <w:t>Mediating Role of Hub Foods</w:t>
       </w:r>
     </w:p>
     <w:p>
       <w:r>
-        <w:rPr>
-          <w:b/>
-        </w:rPr>
-        <w:t>[INSERT: Figure 1 - Network Visualizations (11 panels)]</w:t>
+        <w:t>To quantify the mediating role of hub foods in dietary networks, we compared high-consumption versus low-consumption groups (divided by median intake frequency) and examined how hub food intake influences consumption of network-connected foods through multiple linear regression analysis. For each identified hub food, participants were classified into high versus low consumption groups based on median intake frequency assessed via the food frequency questionnaire. The statistical model employed multiple linear regression with consumption scores (0-5 scale) of each connected food group as dependent variables, hub food consumption group (high versus low) as the independent variable, and extensive covariate adjustment including demographic factors (age, education level, household income), lifestyle factors (physical activity measured in MET-minutes per week, smoking status categorized as current/past/never, alcohol frequency measured in times per week), dietary factors (total energy intake in kcal/day), and clinical factors (BMI, number of chronic diseases ranging from 0-5). Effect sizes were quantified using standardized regression coefficients (β), with conventional interpretation thresholds of β=0.3 (small effect), β=0.5 (moderate effect), and β=0.8 (large effect).</w:t>
       </w:r>
     </w:p>
     <w:p>
       <w:r>
-        <w:rPr>
-          <w:i/>
-        </w:rPr>
-        <w:t>*Figure 1 displays the food network structures for each subgroup, visualizing the centrality of hub foods. Detailed hub food information is provided in Supplementary Table S1.*</w:t>
-      </w:r>
-    </w:p>
-    <w:p>
-      <w:pPr>
-        <w:pStyle w:val="Heading3"/>
-      </w:pPr>
-      <w:r>
-        <w:t>Graphical Gaussian Model (GGM)-Based Network Construction</w:t>
+        <w:t>Across the 11 analyzed subgroups, we observed a total of 214 statistically significant mediating effects of hub foods on connected food consumption. The overwhelming majority (191 effects, 89%) represented positive associations where high hub food consumption associated with cascading increases in connected food consumption, while a minority (23 effects, 11%) represented negative associations reflecting substitution patterns. The mean effect size across all observed mediating relationships was β=0.45, falling in the moderate-to-large range and indicating substantial practical significance. The strongest mediating effects observed included processed foods → sugar-sweetened beverages (β=+0.90, p&lt;0.001), indicating that individuals with high processed food consumption consumed nearly one standard deviation more sugar-sweetened beverages; vegetables → protein foods (β=+1.02 to +1.04, p&lt;0.001) in male young adults MetS(-) group, suggesting coordinated consumption of these nutritionally complementary food groups; and fried foods → high-fat meat (β=+0.85 to +0.87, p&lt;0.001), reflecting clustering of energy-dense, high-fat food consumption patterns. Representative case examples illustrate the magnitude of these cascade effects. Among male middle-aged MetS(+) individuals, where fried foods functioned as the primary hub (0.364 centrality), high fried food consumption (n=182) versus low consumption (n=1,939) associated with substantially elevated consumption of high-fat meat (β=+0.87, p&lt;0.001), processed foods (β=+0.73, p&lt;0.001), sugar-sweetened beverages (β=+0.64, p&lt;0.001), protein foods (β=+0.47, p&lt;0.001), and even vegetables (β=+0.33, p&lt;0.001), demonstrating that hub food consumption influences both nutritionally similar and dissimilar food groups. Among the same subgroup, high processed food consumption (n=228) versus low consumption (n=1,689) associated with the strongest observed cascade effect: sugar-sweetened beverages (β=+0.90, p&lt;0.001), along with elevated fried foods (β=+0.61, p&lt;0.001), high-fat meat (β=+0.58, p&lt;0.001), added salt (β=+0.26, p&lt;0.01), and salty foods (β=+0.34, p&lt;0.001). An example of negative mediation emerged in female middle-aged MetS(+) individuals, where high consumption of high-fat meat (n=26) versus low consumption (n=506) associated not only with elevated processed foods (β=+0.89, p&lt;0.001) and fried foods (β=+0.55, p&lt;0.001), but also with reduced fruit consumption (β=-0.45, p&lt;0.01), illustrating a substitution pattern where unhealthy food consumption displaces healthy food consumption.</w:t>
       </w:r>
     </w:p>
     <w:p>
       <w:r>
-        <w:t>Dietary networks were constructed using Graphical Gaussian Models, which estimate **partial correlations** between food groups after controlling for all other food groups. This approach reveals the conditional dependencies—the unique pairwise associations independent of other dietary components. Edges were established between food group nodes when partial correlations reached statistical significance (p &lt; 0.05). Positive correlations (green edges) indicate co-consumption tendencies, while negative correlations (red edges) reflect substitution patterns where consumption of one food group associates with reduced intake of another. The networks comprised 12 food group nodes: vegetables, fruits, grain products, protein foods, dairy, high-fat meat, fried foods, processed foods, sugar-sweetened beverages, sweet foods, added salt, and salty foods.</w:t>
+        <w:t>These findings establish that hub foods function as "leverage points" within dietary networks, where modulation of a single hub food triggers cascading changes across an average of 4-6 connected foods. The predominance of positive mediating effects (89% of relationships) suggests that reducing unhealthy food hubs can initiate a virtuous cycle wherein consumption of other unhealthy foods also declines, while strengthening healthy food hubs can promote coordinated increases in other nutritious food groups. This network leverage mechanism provides empirical support for hub-focused dietary interventions as an efficient alternative to comprehensive dietary overhauls: rather than attempting to modify all 12 food groups simultaneously—an approach likely to overwhelm patients and reduce adherence—clinicians can target 3-5 strategic hubs and achieve broad dietary pattern improvements through cascade effects. The substantial effect sizes observed (mean β=0.45) indicate that these cascades are not merely statistical artifacts but represent practically meaningful behavioral changes. Furthermore, the consistency of positive cascade effects across diverse demographic-metabolic subgroups suggests that network leverage is a generalizable phenomenon rather than a context-specific finding, although the specific identity of the most influential hubs varies by subgroup and must be tailored accordingly.</w:t>
       </w:r>
     </w:p>
-    <w:p>
-      <w:pPr>
-        <w:pStyle w:val="Heading3"/>
-      </w:pPr>
-      <w:r>
-        <w:t>Hub Food Definition and Selection Criteria</w:t>
-      </w:r>
-    </w:p>
-    <w:p>
-      <w:r>
-        <w:rPr>
-          <w:b/>
-        </w:rPr>
-        <w:t>Hub foods</w:t>
-      </w:r>
-      <w:r>
-        <w:t>:</w:t>
-      </w:r>
-      <w:r>
-        <w:t xml:space="preserve"> are defined as food groups exhibiting high centrality within the network, characterized by numerous connections to other food groups. We employed **degree centrality** as the primary metric, calculated as DC(i) = k(i) / (N-1), where k(i) represents the number of connections for node i, and N represents the total number of nodes. Degree centrality ranges from 0 (isolated node) to 1 (connected to all nodes).</w:t>
-      </w:r>
-    </w:p>
-    <w:p>
-      <w:r>
-        <w:t>The selection of **top 3 hub foods** per group was justified by several considerations:</w:t>
-      </w:r>
-    </w:p>
-    <w:p>
-      <w:pPr>
-        <w:pStyle w:val="ListBullet"/>
-      </w:pPr>
-      <w:r>
-        <w:t>The top 3 foods accounted for 40-60% of total network connections in each group</w:t>
-      </w:r>
-    </w:p>
-    <w:p>
-      <w:pPr>
-        <w:pStyle w:val="ListBullet"/>
-      </w:pPr>
-      <w:r>
-        <w:t>Intervention feasibility: targeting 3-5 foods is practically manageable for dietary counseling</w:t>
-      </w:r>
-    </w:p>
-    <w:p>
-      <w:pPr>
-        <w:pStyle w:val="ListBullet"/>
-      </w:pPr>
-      <w:r>
-        <w:t>Strong correlation (r &gt; 0.7) with alternative centrality metrics (betweenness centrality, closeness centrality) validated this approach</w:t>
-      </w:r>
-    </w:p>
-    <w:p>
-      <w:pPr>
-        <w:pStyle w:val="Heading3"/>
-      </w:pPr>
-      <w:r>
-        <w:t>Network Structural Characteristics</w:t>
-      </w:r>
-    </w:p>
-    <w:p>
-      <w:r>
-        <w:t>Across the 11 subgroups, networks exhibited the following properties:</w:t>
-      </w:r>
-    </w:p>
-    <w:p>
-      <w:pPr>
-        <w:pStyle w:val="ListBullet"/>
-      </w:pPr>
-      <w:r>
-        <w:t>Number of nodes: 12 (food groups)</w:t>
-      </w:r>
-    </w:p>
-    <w:p>
-      <w:pPr>
-        <w:pStyle w:val="ListBullet"/>
-      </w:pPr>
-      <w:r>
-        <w:t>Number of edges: 10-18</w:t>
-      </w:r>
-    </w:p>
-    <w:p>
-      <w:pPr>
-        <w:pStyle w:val="ListBullet"/>
-      </w:pPr>
-      <w:r>
-        <w:t>Network density: 0.152 (male middle-aged MetS-) to 0.273 (female older MetS-)</w:t>
-      </w:r>
-    </w:p>
-    <w:p>
-      <w:pPr>
-        <w:pStyle w:val="ListBullet"/>
-      </w:pPr>
-      <w:r>
-        <w:t>Density = actual edges / maximum possible edges</w:t>
-      </w:r>
-    </w:p>
-    <w:p>
-      <w:pPr>
-        <w:pStyle w:val="ListBullet"/>
-      </w:pPr>
-      <w:r>
-        <w:t>Low density indicates selective connections and independent dietary patterns</w:t>
-      </w:r>
-    </w:p>
-    <w:p>
-      <w:pPr>
-        <w:pStyle w:val="Heading3"/>
-      </w:pPr>
-      <w:r>
-        <w:t>Key Hub Food Patterns</w:t>
-      </w:r>
-    </w:p>
-    <w:p>
-      <w:r>
-        <w:rPr>
-          <w:b/>
-        </w:rPr>
-        <w:t>Hub Foods in MetS(+) Groups</w:t>
-      </w:r>
-      <w:r>
-        <w:t>:</w:t>
-      </w:r>
-      <w:r>
-        <w:t xml:space="preserve"> (network-central foods):</w:t>
-      </w:r>
-    </w:p>
-    <w:p>
-      <w:pPr>
-        <w:pStyle w:val="ListBullet"/>
-      </w:pPr>
-      <w:r>
-        <w:t>**Processed Foods**: emerged as a hub in 5 groups</w:t>
-      </w:r>
-    </w:p>
-    <w:p>
-      <w:pPr>
-        <w:pStyle w:val="ListBullet"/>
-      </w:pPr>
-      <w:r>
-        <w:t>**Fried Foods**: hub in 4 groups</w:t>
-      </w:r>
-    </w:p>
-    <w:p>
-      <w:pPr>
-        <w:pStyle w:val="ListBullet"/>
-      </w:pPr>
-      <w:r>
-        <w:t>**Protein Foods**: hub in 3 groups</w:t>
-      </w:r>
-    </w:p>
-    <w:p>
-      <w:pPr>
-        <w:pStyle w:val="ListBullet"/>
-      </w:pPr>
-      <w:r>
-        <w:t>**High-Fat Meat**: hub in 2 groups</w:t>
-      </w:r>
-    </w:p>
-    <w:p>
-      <w:pPr>
-        <w:pStyle w:val="ListBullet"/>
-      </w:pPr>
-      <w:r>
-        <w:t>**Sugar-Sweetened Beverages**: hub in 1 group (male middle-aged); frequent appearance in top 5 hubs across multiple groups</w:t>
-      </w:r>
-    </w:p>
-    <w:p>
-      <w:pPr>
-        <w:pStyle w:val="ListBullet"/>
-      </w:pPr>
-      <w:r>
-        <w:t>**Grain Products**: hub in 1 group (male young adults)</w:t>
-      </w:r>
-    </w:p>
-    <w:p>
-      <w:r>
-        <w:rPr>
-          <w:b/>
-        </w:rPr>
-        <w:t>Hub Foods in MetS(-) Groups</w:t>
-      </w:r>
-      <w:r>
-        <w:t>:</w:t>
-      </w:r>
-      <w:r>
-        <w:t xml:space="preserve"> (network-central foods):</w:t>
-      </w:r>
-    </w:p>
-    <w:p>
-      <w:pPr>
-        <w:pStyle w:val="ListBullet"/>
-      </w:pPr>
-      <w:r>
-        <w:t>**Processed Foods**: hub in 6 groups (most frequent)</w:t>
-      </w:r>
-    </w:p>
-    <w:p>
-      <w:pPr>
-        <w:pStyle w:val="ListBullet"/>
-      </w:pPr>
-      <w:r>
-        <w:t>**Fried Foods**: hub in 4 groups</w:t>
-      </w:r>
-    </w:p>
-    <w:p>
-      <w:pPr>
-        <w:pStyle w:val="ListBullet"/>
-      </w:pPr>
-      <w:r>
-        <w:t>**Sugar-Sweetened Beverages**: hub in 3 groups</w:t>
-      </w:r>
-    </w:p>
-    <w:p>
-      <w:pPr>
-        <w:pStyle w:val="ListBullet"/>
-      </w:pPr>
-      <w:r>
-        <w:t>**Protein Foods**: hub in 3 groups</w:t>
-      </w:r>
-    </w:p>
-    <w:p>
-      <w:pPr>
-        <w:pStyle w:val="ListBullet"/>
-      </w:pPr>
-      <w:r>
-        <w:t>**Vegetables**: hub in 2 groups</w:t>
-      </w:r>
-    </w:p>
-    <w:p>
-      <w:r>
-        <w:rPr>
-          <w:b/>
-        </w:rPr>
-        <w:t>Dietary Behavioral Mechanisms of Hub Formation</w:t>
-      </w:r>
-    </w:p>
-    <w:p>
-      <w:pPr>
-        <w:pStyle w:val="ListBullet"/>
-      </w:pPr>
-      <w:r>
-        <w:t>**Processed/Fried Foods as Hubs**: High convenience, palatability, and accessibility drive simultaneous consumption across diverse eating occasions</w:t>
-      </w:r>
-    </w:p>
-    <w:p>
-      <w:pPr>
-        <w:pStyle w:val="ListBullet"/>
-      </w:pPr>
-      <w:r>
-        <w:t>**Healthy Foods (Vegetables/Fruits) as Hubs**: Reflects consistent dietary habits among health-conscious individuals</w:t>
-      </w:r>
-    </w:p>
-    <w:p>
-      <w:pPr>
-        <w:pStyle w:val="ListBullet"/>
-      </w:pPr>
-      <w:r>
-        <w:t>**Hub Concentration in Imbalanced Diets**: In MetS(+) groups, unhealthy foods function as stronger hubs, indicating dietary pattern rigidity</w:t>
-      </w:r>
-    </w:p>
-    <w:p>
-      <w:r>
-        <w:rPr>
-          <w:b/>
-        </w:rPr>
-        <w:t>Sex- and Age-Specific Hub Patterns</w:t>
-      </w:r>
-    </w:p>
-    <w:p>
-      <w:r>
-        <w:rPr>
-          <w:b/>
-        </w:rPr>
-        <w:t>Male Groups</w:t>
-      </w:r>
-    </w:p>
-    <w:p>
-      <w:pPr>
-        <w:pStyle w:val="ListBullet"/>
-      </w:pPr>
-      <w:r>
-        <w:t>**Young adults (20-39 years)**:</w:t>
-      </w:r>
-    </w:p>
-    <w:p>
-      <w:pPr>
-        <w:pStyle w:val="ListBullet"/>
-      </w:pPr>
-      <w:r>
-        <w:t>MetS(-): Fried foods, processed foods, vegetables as network centers—mixture of Western and healthy patterns</w:t>
-      </w:r>
-    </w:p>
-    <w:p>
-      <w:pPr>
-        <w:pStyle w:val="ListBullet"/>
-      </w:pPr>
-      <w:r>
-        <w:t>MetS(+): **Grain products** (0.273 centrality), protein foods, fried foods as network centers—grain products emerge as the #1 hub, potentially reflecting processed grain consumption (bread, noodles)</w:t>
-      </w:r>
-    </w:p>
-    <w:p>
-      <w:pPr>
-        <w:pStyle w:val="ListBullet"/>
-      </w:pPr>
-      <w:r>
-        <w:t>**Middle-aged (40-59 years)**:</w:t>
-      </w:r>
-    </w:p>
-    <w:p>
-      <w:pPr>
-        <w:pStyle w:val="ListBullet"/>
-      </w:pPr>
-      <w:r>
-        <w:t>MetS(-): Processed foods, protein foods, vegetables as network centers—relatively balanced structure</w:t>
-      </w:r>
-    </w:p>
-    <w:p>
-      <w:pPr>
-        <w:pStyle w:val="ListBullet"/>
-      </w:pPr>
-      <w:r>
-        <w:t>MetS(+): **Fried foods** (0.364 centrality, #1 hub), processed foods, protein foods as network centers—fried foods dominate</w:t>
-      </w:r>
-    </w:p>
-    <w:p>
-      <w:pPr>
-        <w:pStyle w:val="ListBullet"/>
-      </w:pPr>
-      <w:r>
-        <w:t>**Older adults (60-79 years)**:</w:t>
-      </w:r>
-    </w:p>
-    <w:p>
-      <w:pPr>
-        <w:pStyle w:val="ListBullet"/>
-      </w:pPr>
-      <w:r>
-        <w:t>MetS(-): High-fat meat, processed foods, protein foods as network centers</w:t>
-      </w:r>
-    </w:p>
-    <w:p>
-      <w:pPr>
-        <w:pStyle w:val="ListBullet"/>
-      </w:pPr>
-      <w:r>
-        <w:t>MetS(+): Processed foods, protein foods, fruits as network centers</w:t>
-      </w:r>
-    </w:p>
-    <w:p>
-      <w:r>
-        <w:rPr>
-          <w:b/>
-        </w:rPr>
-        <w:t>Female Groups</w:t>
-      </w:r>
-    </w:p>
-    <w:p>
-      <w:pPr>
-        <w:pStyle w:val="ListBullet"/>
-      </w:pPr>
-      <w:r>
-        <w:t>**Middle-aged (40-59 years)**:</w:t>
-      </w:r>
-    </w:p>
-    <w:p>
-      <w:pPr>
-        <w:pStyle w:val="ListBullet"/>
-      </w:pPr>
-      <w:r>
-        <w:t>MetS(-): Processed foods, sugar-sweetened beverages, fried foods as network centers (processed foods and beverages show highest centrality: 0.455)</w:t>
-      </w:r>
-    </w:p>
-    <w:p>
-      <w:pPr>
-        <w:pStyle w:val="ListBullet"/>
-      </w:pPr>
-      <w:r>
-        <w:t>MetS(+): **Fried foods (0.455 centrality)**, high-fat meat, processed foods as network centers—concentration in unhealthy food structure</w:t>
-      </w:r>
-    </w:p>
-    <w:p>
-      <w:pPr>
-        <w:pStyle w:val="ListBullet"/>
-      </w:pPr>
-      <w:r>
-        <w:t>**Older adults (60-79 years)**:</w:t>
-      </w:r>
-    </w:p>
-    <w:p>
-      <w:pPr>
-        <w:pStyle w:val="ListBullet"/>
-      </w:pPr>
-      <w:r>
-        <w:t>MetS(-): Fried foods, sugar-sweetened beverages, high-fat meat as network centers</w:t>
-      </w:r>
-    </w:p>
-    <w:p>
-      <w:pPr>
-        <w:pStyle w:val="ListBullet"/>
-      </w:pPr>
-      <w:r>
-        <w:t>MetS(+): Protein foods, processed foods, sugar-sweetened beverages as network centers</w:t>
-      </w:r>
-    </w:p>
-    <w:p>
-      <w:r>
-        <w:rPr>
-          <w:b/>
-        </w:rPr>
-        <w:t>Notable Findings</w:t>
-      </w:r>
-    </w:p>
-    <w:p>
-      <w:pPr>
-        <w:pStyle w:val="ListBullet"/>
-      </w:pPr>
-      <w:r>
-        <w:t>**Male young adults MetS(+)**: Distinctive emergence of 'grain products' as a major hub—reflecting co-consumption of processed grain products (bread, noodles) with other unhealthy foods</w:t>
-      </w:r>
-    </w:p>
-    <w:p>
-      <w:pPr>
-        <w:pStyle w:val="ListBullet"/>
-      </w:pPr>
-      <w:r>
-        <w:t>**Female middle-aged MetS(+)**: 'Fried foods' exhibit dominant centrality (0.455), driving network structure—reflects middle-aged women's dependence on convenience foods</w:t>
-      </w:r>
-    </w:p>
-    <w:p>
-      <w:pPr>
-        <w:pStyle w:val="ListBullet"/>
-      </w:pPr>
-      <w:r>
-        <w:t>**MetS(-) groups**: Even in healthy groups, processed foods and fried foods frequently appear as hubs; however, vegetables and protein foods also function as hubs, maintaining dietary balance</w:t>
-      </w:r>
-    </w:p>
-    <w:p>
-      <w:r>
-        <w:rPr>
-          <w:b/>
-        </w:rPr>
-        <w:t>Hub Centrality Range</w:t>
-      </w:r>
-    </w:p>
-    <w:p>
-      <w:pPr>
-        <w:pStyle w:val="ListBullet"/>
-      </w:pPr>
-      <w:r>
-        <w:t>Highest centrality: 0.455 (female middle-aged MetS+ fried foods; female middle-aged/older MetS- sugar-sweetened beverages + processed foods)</w:t>
-      </w:r>
-    </w:p>
-    <w:p>
-      <w:pPr>
-        <w:pStyle w:val="ListBullet"/>
-      </w:pPr>
-      <w:r>
-        <w:t>General centrality: 0.182-0.364</w:t>
-      </w:r>
-    </w:p>
-    <w:p>
-      <w:pPr>
-        <w:pStyle w:val="ListBullet"/>
-      </w:pPr>
-      <w:r>
-        <w:t>Interpretation: 0.455 indicates connection to 5 out of 12 nodes (approximately 45%)</w:t>
-      </w:r>
-    </w:p>
-    <w:p>
-      <w:pPr>
-        <w:pStyle w:val="Heading3"/>
-      </w:pPr>
-      <w:r>
-        <w:t>Community Structure Analysis</w:t>
-      </w:r>
-    </w:p>
-    <w:p>
-      <w:r>
-        <w:rPr>
-          <w:b/>
-        </w:rPr>
-        <w:t>[Reference: Supplementary Figure S2, Table S3]</w:t>
-      </w:r>
-    </w:p>
-    <w:p>
-      <w:r>
-        <w:rPr>
-          <w:i/>
-        </w:rPr>
-        <w:t>*Figure S2 visualizes community structures detected by the Louvain algorithm.*</w:t>
-      </w:r>
-    </w:p>
-    <w:p>
-      <w:r>
-        <w:t>Network community analysis revealed **three major dietary pattern clusters** consistently identified across all subgroups:</w:t>
-      </w:r>
-    </w:p>
-    <w:p>
-      <w:r>
-        <w:rPr>
-          <w:b/>
-        </w:rPr>
-        <w:t>Community Detection Method</w:t>
-      </w:r>
-      <w:r>
-        <w:t>:</w:t>
-      </w:r>
-      <w:r>
-        <w:t xml:space="preserve"> Louvain Algorithm</w:t>
-      </w:r>
-    </w:p>
-    <w:p>
-      <w:pPr>
-        <w:pStyle w:val="ListBullet"/>
-      </w:pPr>
-      <w:r>
-        <w:t>Maximizes modularity (Q) to group tightly connected nodes into clusters</w:t>
-      </w:r>
-    </w:p>
-    <w:p>
-      <w:pPr>
-        <w:pStyle w:val="ListBullet"/>
-      </w:pPr>
-      <w:r>
-        <w:t>Q value range: -1 to 1 (Q &gt; 0.3 indicates meaningful community structure)</w:t>
-      </w:r>
-    </w:p>
-    <w:p>
-      <w:r>
-        <w:rPr>
-          <w:b/>
-        </w:rPr>
-        <w:t>Dietary Pattern Communities</w:t>
-      </w:r>
-    </w:p>
-    <w:p>
-      <w:r>
-        <w:t>1. **Traditional Korean Diet Pattern**:</w:t>
-      </w:r>
-    </w:p>
-    <w:p>
-      <w:pPr>
-        <w:pStyle w:val="ListBullet"/>
-      </w:pPr>
-      <w:r>
-        <w:t>Composition: vegetables, fruits, grain products, protein foods, dairy</w:t>
-      </w:r>
-    </w:p>
-    <w:p>
-      <w:pPr>
-        <w:pStyle w:val="ListBullet"/>
-      </w:pPr>
-      <w:r>
-        <w:t>Characteristic: healthy food groups form a single cluster</w:t>
-      </w:r>
-    </w:p>
-    <w:p>
-      <w:pPr>
-        <w:pStyle w:val="ListBullet"/>
-      </w:pPr>
-      <w:r>
-        <w:t>Consistently observed across all groups</w:t>
-      </w:r>
-    </w:p>
-    <w:p>
-      <w:pPr>
-        <w:pStyle w:val="ListBullet"/>
-      </w:pPr>
-      <w:r>
-        <w:t>Nutritional significance: provides balanced macro- and micronutrients</w:t>
-      </w:r>
-    </w:p>
-    <w:p>
-      <w:r>
-        <w:t>2. **Western/Processed Food Pattern**:</w:t>
-      </w:r>
-    </w:p>
-    <w:p>
-      <w:pPr>
-        <w:pStyle w:val="ListBullet"/>
-      </w:pPr>
-      <w:r>
-        <w:t>Composition: fried foods, processed foods, sugar-sweetened beverages, high-fat meat, sweet foods</w:t>
-      </w:r>
-    </w:p>
-    <w:p>
-      <w:pPr>
-        <w:pStyle w:val="ListBullet"/>
-      </w:pPr>
-      <w:r>
-        <w:t>Characteristic: unhealthy food groups are tightly interconnected</w:t>
-      </w:r>
-    </w:p>
-    <w:p>
-      <w:pPr>
-        <w:pStyle w:val="ListBullet"/>
-      </w:pPr>
-      <w:r>
-        <w:t>Shows high internal density (0.8) particularly in MetS(+) groups, especially male middle-aged</w:t>
-      </w:r>
-    </w:p>
-    <w:p>
-      <w:pPr>
-        <w:pStyle w:val="ListBullet"/>
-      </w:pPr>
-      <w:r>
-        <w:t>Metabolic risk: high calorie, high saturated fat, high sugar, low fiber</w:t>
-      </w:r>
-    </w:p>
-    <w:p>
-      <w:r>
-        <w:t>3. **High Sodium Pattern**:</w:t>
-      </w:r>
-    </w:p>
-    <w:p>
-      <w:pPr>
-        <w:pStyle w:val="ListBullet"/>
-      </w:pPr>
-      <w:r>
-        <w:t>Composition: added salt use, salty food consumption</w:t>
-      </w:r>
-    </w:p>
-    <w:p>
-      <w:pPr>
-        <w:pStyle w:val="ListBullet"/>
-      </w:pPr>
-      <w:r>
-        <w:t>Characteristic: separates independently from other patterns</w:t>
-      </w:r>
-    </w:p>
-    <w:p>
-      <w:pPr>
-        <w:pStyle w:val="ListBullet"/>
-      </w:pPr>
-      <w:r>
-        <w:t>Exists as a distinct cluster across all groups</w:t>
-      </w:r>
-    </w:p>
-    <w:p>
-      <w:pPr>
-        <w:pStyle w:val="ListBullet"/>
-      </w:pPr>
-      <w:r>
-        <w:t>Clinical significance: represents an independent target for blood pressure management</w:t>
-      </w:r>
-    </w:p>
-    <w:p>
-      <w:r>
-        <w:rPr>
-          <w:b/>
-        </w:rPr>
-        <w:t>Modularity (Q values)</w:t>
-      </w:r>
-    </w:p>
-    <w:p>
-      <w:pPr>
-        <w:pStyle w:val="ListBullet"/>
-      </w:pPr>
-      <w:r>
-        <w:t>Range: 0.411-0.618</w:t>
-      </w:r>
-    </w:p>
-    <w:p>
-      <w:pPr>
-        <w:pStyle w:val="ListBullet"/>
-      </w:pPr>
-      <w:r>
-        <w:t>Highest: **Male middle-aged MetS(-) Q=0.618** (clearest separation between healthy and unhealthy patterns)</w:t>
-      </w:r>
-    </w:p>
-    <w:p>
-      <w:pPr>
-        <w:pStyle w:val="ListBullet"/>
-      </w:pPr>
-      <w:r>
-        <w:t>Lowest: **Female older MetS(-) Q=0.411** (relatively less distinct pattern boundaries)</w:t>
-      </w:r>
-    </w:p>
-    <w:p>
-      <w:pPr>
-        <w:pStyle w:val="ListBullet"/>
-      </w:pPr>
-      <w:r>
-        <w:t>Interpretation: Q &gt; 0.4 across all groups indicates clear community structure</w:t>
-      </w:r>
-    </w:p>
-    <w:p>
-      <w:r>
-        <w:rPr>
-          <w:b/>
-        </w:rPr>
-        <w:t>Clinical Implications</w:t>
-      </w:r>
-    </w:p>
-    <w:p>
-      <w:pPr>
-        <w:pStyle w:val="ListBullet"/>
-      </w:pPr>
-      <w:r>
-        <w:t>Healthy and unhealthy dietary patterns can **coexist independently**</w:t>
-      </w:r>
-    </w:p>
-    <w:p>
-      <w:pPr>
-        <w:pStyle w:val="ListBullet"/>
-      </w:pPr>
-      <w:r>
-        <w:t>Hub foods primarily function as central nodes **within the Western/processed food community**</w:t>
-      </w:r>
-    </w:p>
-    <w:p>
-      <w:pPr>
-        <w:pStyle w:val="ListBullet"/>
-      </w:pPr>
-      <w:r>
-        <w:t>Personalized interventions require **community-specific approaches** (e.g., reducing entire Western pattern vs. targeting high-sodium pattern alone)</w:t>
-      </w:r>
-    </w:p>
+    <w:p/>
     <w:p>
       <w:pPr>
         <w:pStyle w:val="Heading2"/>
       </w:pPr>
       <w:r>
-        <w:t>3.3. Mediating Role of Hub Foods</w:t>
+        <w:t>Associations Between Hub Foods and Health Indicators</w:t>
       </w:r>
     </w:p>
     <w:p>
       <w:r>
-        <w:rPr>
-          <w:b/>
-        </w:rPr>
-        <w:t>[INSERT: Table 2 - Hub Foods Cascade Effects]</w:t>
-      </w:r>
-    </w:p>
-    <w:p>
-      <w:pPr>
-        <w:pStyle w:val="Heading3"/>
-      </w:pPr>
-      <w:r>
-        <w:t>Table 2: Cascade Effects of Hub Foods</w:t>
+        <w:t>Beyond their network-level effects on dietary patterns, hub foods demonstrated direct associations with metabolic health indicators, constituting the second component of the dual leverage mechanism. We compared high-consumption versus low-consumption groups for each identified hub food and examined associations with six key health indicators—BMI, waist circumference, systolic blood pressure, fasting glucose, HDL-cholesterol, and triglycerides—using multiple linear regression with extensive covariate adjustment. Covariates included demographic factors (age as a continuous variable, education level categorized into 4 levels, household income in quartiles), lifestyle factors (physical activity in MET-minutes per week, smoking status as current/past/never smoker, alcohol frequency in times per week), dietary factors (total energy intake in kcal/day), and clinical factors (number of chronic diseases ranging from 0-5, medication use as a binary variable). The regression coefficient (β) quantifies the mean difference in health indicators between high versus low hub consumption groups after adjusting for all covariates. To interpret clinical significance, we note that β=+1.0 kg/m² for BMI represents a clinically meaningful change equivalent to advancing one obesity stage; β=+25 mg/dL for triglycerides indicates increased cardiovascular risk even within the normal range (&lt;150 mg/dL); β=+2 mg/dL for HDL-cholesterol is meaningful given that each 10 mg/dL increase associates with approximately 30% reduction in cardiovascular risk; and β=+2.5 cm for waist circumference represents a threshold for increased metabolic risk according to metabolic syndrome criteria.</w:t>
       </w:r>
     </w:p>
     <w:p>
       <w:r>
-        <w:t>To quantify the mediating role of hub foods, we compared high-consumption versus low-consumption groups (divided by median intake frequency) and examined how hub food intake influences consumption of network-connected foods.</w:t>
+        <w:t>Among MetS(-) groups (prevention context), we observed a total of 26 statistically significant associations between hub foods and health indicators, with 15 associations (58%) in the risk direction (unfavorable metabolic changes associated with hub consumption) and 11 associations (42%) in the protective direction (favorable metabolic changes). Risk hubs in MetS(-) groups primarily comprised processed foods and fried foods, where high consumption associated with BMI increases of 0.27-1.12 kg/m² (p&lt;0.001), waist circumference increases of 0.74-1.24 cm (p&lt;0.01), and triglyceride increases of 7-11 mg/dL. These findings indicate that even among metabolically healthy individuals, consumption of unhealthy hub foods exerts measurable adverse effects on metabolic parameters, supporting their role as targets for primary prevention. Conversely, protective hubs in MetS(-) groups comprised primarily vegetables and protein foods, where high consumption associated with triglyceride reductions of 7-9 mg/dL (p&lt;0.001) and HDL-cholesterol increases of 0.93-1.81 mg/dL (p&lt;0.05). The magnitude of these protective effects—particularly the triglyceride reductions approaching 10 mg/dL—represents clinically significant metabolic improvement that could contribute to long-term cardiovascular risk reduction. These patterns suggest that prevention strategies in metabolically healthy populations should adopt a dual approach: minimize unhealthy hub consumption to prevent metabolic deterioration, and actively strengthen healthy hub consumption to promote metabolic resilience.</w:t>
       </w:r>
     </w:p>
     <w:p>
       <w:r>
-        <w:rPr>
-          <w:b/>
-        </w:rPr>
-        <w:t>Analytical Methods</w:t>
-      </w:r>
-    </w:p>
-    <w:p>
-      <w:pPr>
-        <w:pStyle w:val="ListBullet"/>
-      </w:pPr>
-      <w:r>
-        <w:t>**Group Classification**: For each hub food, participants were classified into high vs. low consumption groups based on median intake frequency</w:t>
-      </w:r>
-    </w:p>
-    <w:p>
-      <w:pPr>
-        <w:pStyle w:val="ListBullet"/>
-      </w:pPr>
-      <w:r>
-        <w:t>**Statistical Model**: Multiple linear regression</w:t>
-      </w:r>
-    </w:p>
-    <w:p>
-      <w:pPr>
-        <w:pStyle w:val="ListBullet"/>
-      </w:pPr>
-      <w:r>
-        <w:t>Dependent variable: consumption score (0-5 scale) of each connected food group</w:t>
-      </w:r>
-    </w:p>
-    <w:p>
-      <w:pPr>
-        <w:pStyle w:val="ListBullet"/>
-      </w:pPr>
-      <w:r>
-        <w:t>Independent variable: hub food consumption group (high vs. low)</w:t>
-      </w:r>
-    </w:p>
-    <w:p>
-      <w:pPr>
-        <w:pStyle w:val="ListBullet"/>
-      </w:pPr>
-      <w:r>
-        <w:t>Covariates:</w:t>
-      </w:r>
-    </w:p>
-    <w:p>
-      <w:pPr>
-        <w:pStyle w:val="ListBullet"/>
-      </w:pPr>
-      <w:r>
-        <w:t>Demographic: age, education level, household income</w:t>
-      </w:r>
-    </w:p>
-    <w:p>
-      <w:pPr>
-        <w:pStyle w:val="ListBullet"/>
-      </w:pPr>
-      <w:r>
-        <w:t>Lifestyle: physical activity, smoking, alcohol consumption</w:t>
-      </w:r>
-    </w:p>
-    <w:p>
-      <w:pPr>
-        <w:pStyle w:val="ListBullet"/>
-      </w:pPr>
-      <w:r>
-        <w:t>Clinical: BMI, number of chronic diseases</w:t>
-      </w:r>
-    </w:p>
-    <w:p>
-      <w:pPr>
-        <w:pStyle w:val="ListBullet"/>
-      </w:pPr>
-      <w:r>
-        <w:t>**Effect Size**: Standardized regression coefficient (β)</w:t>
-      </w:r>
-    </w:p>
-    <w:p>
-      <w:pPr>
-        <w:pStyle w:val="ListBullet"/>
-      </w:pPr>
-      <w:r>
-        <w:t>β = 0.3: small effect</w:t>
-      </w:r>
-    </w:p>
-    <w:p>
-      <w:pPr>
-        <w:pStyle w:val="ListBullet"/>
-      </w:pPr>
-      <w:r>
-        <w:t>β = 0.5: moderate effect</w:t>
-      </w:r>
-    </w:p>
-    <w:p>
-      <w:pPr>
-        <w:pStyle w:val="ListBullet"/>
-      </w:pPr>
-      <w:r>
-        <w:t>β = 0.8: large effect</w:t>
+        <w:t>Among MetS(+) groups (disease management context), we observed 18 statistically significant hub-health associations, with 15 associations (83%) in the deterioration direction (unfavorable metabolic changes) and only 3 associations (17%) in the amelioration direction (favorable changes). This skewed distribution reflects the heightened metabolic vulnerability of individuals with established MetS, where unhealthy hub foods exert amplified adverse effects. High-risk hubs in MetS(+) groups, particularly fried foods and processed foods, associated with BMI increases of 0.94-1.01 kg/m² (p&lt;0.001), waist circumference increases of 2.20-2.93 cm (p&lt;0.001)—approximately double the magnitude observed in MetS(-) groups—and triglyceride increases of 25 mg/dL (p&lt;0.001). The most striking finding was the effect of high grain product consumption in male young adults MetS(+), which associated with triglyceride increases of 43.4 mg/dL (p&lt;0.05)—the largest single effect observed in this study. This likely reflects the high glycemic index of processed grain products (refined bread, noodles, cereals) commonly consumed in this demographic, which promote postprandial glucose spikes, compensatory insulin secretion, and hepatic de novo lipogenesis driving triglyceride synthesis. Protein foods exhibited bidirectional effects depending on context: in male middle-aged MetS(+) individuals, high protein consumption unexpectedly associated with metabolic deterioration, possibly reflecting consumption of high-fat protein sources (fatty meats), whereas in female older MetS(+) individuals, high protein consumption associated with HDL-cholesterol increases of 2.8 mg/dL (p=0.076, marginally significant), potentially reflecting protein's role in mitigating age-related sarcopenia and maintaining metabolic function. Critically, a direct comparison of effect sizes between MetS(-) and MetS(+) groups revealed that hub foods exerted on average 1.8-fold stronger effects on health indicators in MetS(+) versus MetS(-) groups. For example, high fried food consumption associated with waist circumference increases of +2.9 cm in MetS(+) male middle-aged adults compared to +1.2 cm in their MetS(-) counterparts, despite similar levels of covariate adjustment. This amplification phenomenon suggests that individuals with established metabolic dysregulation exhibit heightened susceptibility to dietary influences, making hub food modulation particularly urgent and clinically impactful in disease management contexts.</w:t>
       </w:r>
     </w:p>
     <w:p>
       <w:r>
-        <w:rPr>
-          <w:b/>
-        </w:rPr>
-        <w:t>Overall Results Summary</w:t>
+        <w:t>The dual-nature of certain hubs—where the same food group associates with different health outcomes across subgroups—underscores the necessity of personalized dietary strategies. Protein foods, for instance, cannot be universally categorized as uniformly beneficial or harmful; rather, their effects depend on the demographic-metabolic context, the specific protein sources consumed (lean versus fatty), and the overall dietary matrix in which they are embedded. This heterogeneity of effects provides strong empirical support for stratified dietary recommendations tailored to sex, age, and metabolic status, rather than population-level guidelines that may obscure critical subgroup-specific patterns. The clinical interpretation of these findings is clear: for MetS(-) groups, dietary counseling should emphasize minimizing unhealthy hub consumption to prevent metabolic decline while actively promoting healthy hub consumption to build metabolic resilience; for MetS(+) groups, dietary counseling must prioritize strict limitation of high-risk hubs given their amplified adverse effects, while selectively enhancing protective hubs where evidence supports metabolic benefits. The identification of specific hub-health associations for each subgroup enables clinicians to deliver precise, evidence-based recommendations with clear expected outcomes, enhancing both the scientific rigor and practical credibility of dietary interventions.</w:t>
       </w:r>
     </w:p>
-    <w:p>
-      <w:pPr>
-        <w:pStyle w:val="ListBullet"/>
-      </w:pPr>
-      <w:r>
-        <w:t>**Analysis scope**: Mediating effects of hub foods identified across 11 subgroups</w:t>
-      </w:r>
-    </w:p>
-    <w:p>
-      <w:pPr>
-        <w:pStyle w:val="ListBullet"/>
-      </w:pPr>
-      <w:r>
-        <w:t>**Primary hubs examined**: Processed foods, fried foods, protein foods, sugar-sweetened beverages, high-fat meat</w:t>
-      </w:r>
-    </w:p>
-    <w:p>
-      <w:pPr>
-        <w:pStyle w:val="ListBullet"/>
-      </w:pPr>
-      <w:r>
-        <w:t>**Magnitude of mediating effects**:</w:t>
-      </w:r>
-    </w:p>
-    <w:p>
-      <w:pPr>
-        <w:pStyle w:val="ListBullet"/>
-      </w:pPr>
-      <w:r>
-        <w:t>Total of 214 significant mediating effects observed</w:t>
-      </w:r>
-    </w:p>
-    <w:p>
-      <w:pPr>
-        <w:pStyle w:val="ListBullet"/>
-      </w:pPr>
-      <w:r>
-        <w:t>Positive associations (co-consumption increase): 191 effects (89%)</w:t>
-      </w:r>
-    </w:p>
-    <w:p>
-      <w:pPr>
-        <w:pStyle w:val="ListBullet"/>
-      </w:pPr>
-      <w:r>
-        <w:t>Negative associations (inverse correlation): 23 effects (11%)</w:t>
-      </w:r>
-    </w:p>
-    <w:p>
-      <w:pPr>
-        <w:pStyle w:val="ListBullet"/>
-      </w:pPr>
-      <w:r>
-        <w:t>Average effect size: β = 0.45 (moderate to large effect)</w:t>
-      </w:r>
-    </w:p>
-    <w:p>
-      <w:pPr>
-        <w:pStyle w:val="ListBullet"/>
-      </w:pPr>
-      <w:r>
-        <w:t>**Strongest mediating effects**:</w:t>
-      </w:r>
-    </w:p>
-    <w:p>
-      <w:pPr>
-        <w:pStyle w:val="ListBullet"/>
-      </w:pPr>
-      <w:r>
-        <w:t>Processed foods → Sugar-sweetened beverages: β = +0.90*** (strong co-consumption)</w:t>
-      </w:r>
-    </w:p>
-    <w:p>
-      <w:pPr>
-        <w:pStyle w:val="ListBullet"/>
-      </w:pPr>
-      <w:r>
-        <w:t>Vegetables → Protein foods: β = +1.02~1.04*** (male young adults MetS- group)</w:t>
-      </w:r>
-    </w:p>
-    <w:p>
-      <w:pPr>
-        <w:pStyle w:val="ListBullet"/>
-      </w:pPr>
-      <w:r>
-        <w:t>Fried foods → High-fat meat: β = +0.85~0.87***</w:t>
-      </w:r>
-    </w:p>
-    <w:p>
-      <w:r>
-        <w:rPr>
-          <w:b/>
-        </w:rPr>
-        <w:t>Key Finding</w:t>
-      </w:r>
-      <w:r>
-        <w:t>:</w:t>
-      </w:r>
-      <w:r>
-        <w:t xml:space="preserve"> High consumption of hub foods is associated with cascading increases in consumption of network-connected foods.</w:t>
-      </w:r>
-    </w:p>
-    <w:p>
-      <w:pPr>
-        <w:pStyle w:val="Heading3"/>
-      </w:pPr>
-      <w:r>
-        <w:t>Representative Case Studies</w:t>
-      </w:r>
-    </w:p>
-    <w:p>
-      <w:r>
-        <w:rPr>
-          <w:b/>
-        </w:rPr>
-        <w:t>Example 1: Mediating Effects of Fried Foods Hub</w:t>
-      </w:r>
-    </w:p>
-    <w:p>
-      <w:pPr>
-        <w:pStyle w:val="ListBullet"/>
-      </w:pPr>
-      <w:r>
-        <w:t>**Male middle-aged MetS(+)**: Fried foods high-consumption group (n=182) vs. low-consumption group (n=1,939)</w:t>
-      </w:r>
-    </w:p>
-    <w:p>
-      <w:pPr>
-        <w:pStyle w:val="ListBullet"/>
-      </w:pPr>
-      <w:r>
-        <w:t>High-fat meat: β = +0.87*** (p&lt;0.001)</w:t>
-      </w:r>
-    </w:p>
-    <w:p>
-      <w:pPr>
-        <w:pStyle w:val="ListBullet"/>
-      </w:pPr>
-      <w:r>
-        <w:t>Processed foods: β = +0.73*** (p&lt;0.001)</w:t>
-      </w:r>
-    </w:p>
-    <w:p>
-      <w:pPr>
-        <w:pStyle w:val="ListBullet"/>
-      </w:pPr>
-      <w:r>
-        <w:t>Sugar-sweetened beverages: β = +0.64*** (p&lt;0.001)</w:t>
-      </w:r>
-    </w:p>
-    <w:p>
-      <w:pPr>
-        <w:pStyle w:val="ListBullet"/>
-      </w:pPr>
-      <w:r>
-        <w:t>Protein foods: β = +0.47*** (p&lt;0.001)</w:t>
-      </w:r>
-    </w:p>
-    <w:p>
-      <w:pPr>
-        <w:pStyle w:val="ListBullet"/>
-      </w:pPr>
-      <w:r>
-        <w:t>Vegetables: β = +0.33*** (p&lt;0.001)</w:t>
-      </w:r>
-    </w:p>
-    <w:p>
-      <w:pPr>
-        <w:pStyle w:val="ListBullet"/>
-      </w:pPr>
-      <w:r>
-        <w:t>**Interpretation**: Individuals frequently consuming fried foods consume 0.87 standard deviations more high-fat meat</w:t>
-      </w:r>
-    </w:p>
-    <w:p>
-      <w:r>
-        <w:rPr>
-          <w:b/>
-        </w:rPr>
-        <w:t>Example 2: Mediating Effects of Processed Foods Hub</w:t>
-      </w:r>
-    </w:p>
-    <w:p>
-      <w:pPr>
-        <w:pStyle w:val="ListBullet"/>
-      </w:pPr>
-      <w:r>
-        <w:t>**Male middle-aged MetS(+)**: Processed foods high-consumption group (n=228) vs. low-consumption group (n=1,689)</w:t>
-      </w:r>
-    </w:p>
-    <w:p>
-      <w:pPr>
-        <w:pStyle w:val="ListBullet"/>
-      </w:pPr>
-      <w:r>
-        <w:t>Sugar-sweetened beverages: β = +0.90*** (p&lt;0.001)</w:t>
-      </w:r>
-    </w:p>
-    <w:p>
-      <w:pPr>
-        <w:pStyle w:val="ListBullet"/>
-      </w:pPr>
-      <w:r>
-        <w:t>Fried foods: β = +0.61*** (p&lt;0.001)</w:t>
-      </w:r>
-    </w:p>
-    <w:p>
-      <w:pPr>
-        <w:pStyle w:val="ListBullet"/>
-      </w:pPr>
-      <w:r>
-        <w:t>High-fat meat: β = +0.58*** (p&lt;0.001)</w:t>
-      </w:r>
-    </w:p>
-    <w:p>
-      <w:pPr>
-        <w:pStyle w:val="ListBullet"/>
-      </w:pPr>
-      <w:r>
-        <w:t>Added salt: β = +0.26** (p&lt;0.01)</w:t>
-      </w:r>
-    </w:p>
-    <w:p>
-      <w:pPr>
-        <w:pStyle w:val="ListBullet"/>
-      </w:pPr>
-      <w:r>
-        <w:t>Salty foods: β = +0.34*** (p&lt;0.001)</w:t>
-      </w:r>
-    </w:p>
-    <w:p>
-      <w:pPr>
-        <w:pStyle w:val="ListBullet"/>
-      </w:pPr>
-      <w:r>
-        <w:t>**Interpretation**: Strong co-consumption pattern between processed foods and sugar-sweetened beverages (β=0.90)</w:t>
-      </w:r>
-    </w:p>
-    <w:p>
-      <w:r>
-        <w:rPr>
-          <w:b/>
-        </w:rPr>
-        <w:t>Example 3: Mediating Effects of High-Fat Meat Hub</w:t>
-      </w:r>
-    </w:p>
-    <w:p>
-      <w:pPr>
-        <w:pStyle w:val="ListBullet"/>
-      </w:pPr>
-      <w:r>
-        <w:t>**Female middle-aged MetS(+)**: High-fat meat high-consumption group (n=26) vs. low-consumption group (n=506)</w:t>
-      </w:r>
-    </w:p>
-    <w:p>
-      <w:pPr>
-        <w:pStyle w:val="ListBullet"/>
-      </w:pPr>
-      <w:r>
-        <w:t>Processed foods: β = +0.89*** (p&lt;0.001)</w:t>
-      </w:r>
-    </w:p>
-    <w:p>
-      <w:pPr>
-        <w:pStyle w:val="ListBullet"/>
-      </w:pPr>
-      <w:r>
-        <w:t>Fried foods: β = +0.55*** (p&lt;0.001)</w:t>
-      </w:r>
-    </w:p>
-    <w:p>
-      <w:pPr>
-        <w:pStyle w:val="ListBullet"/>
-      </w:pPr>
-      <w:r>
-        <w:t>Fruits: β = -0.45** (p&lt;0.01) (negative correlation: high-fat meat consumption associated with reduced fruit intake)</w:t>
-      </w:r>
-    </w:p>
-    <w:p>
-      <w:pPr>
-        <w:pStyle w:val="ListBullet"/>
-      </w:pPr>
-      <w:r>
-        <w:t>**Interpretation**: Pattern of unhealthy food consumption substituting for healthy food consumption</w:t>
-      </w:r>
-    </w:p>
-    <w:p>
-      <w:r>
-        <w:rPr>
-          <w:b/>
-        </w:rPr>
-        <w:t>Mechanistic Interpretation</w:t>
-      </w:r>
-    </w:p>
-    <w:p>
-      <w:pPr>
-        <w:pStyle w:val="ListBullet"/>
-      </w:pPr>
-      <w:r>
-        <w:t>Increased consumption of a single hub food → cascading increases in network-connected foods</w:t>
-      </w:r>
-    </w:p>
-    <w:p>
-      <w:pPr>
-        <w:pStyle w:val="ListBullet"/>
-      </w:pPr>
-      <w:r>
-        <w:t>Processed foods/fried foods hubs strongly interconnect with other unhealthy foods (sugar-sweetened beverages, high-fat meat)</w:t>
-      </w:r>
-    </w:p>
-    <w:p>
-      <w:pPr>
-        <w:pStyle w:val="ListBullet"/>
-      </w:pPr>
-      <w:r>
-        <w:t>Hub foods function as **"leverage points"** in dietary patterns → modulating hubs alone can improve overall dietary patterns</w:t>
-      </w:r>
-    </w:p>
-    <w:p>
-      <w:pPr>
-        <w:pStyle w:val="ListBullet"/>
-      </w:pPr>
-      <w:r>
-        <w:t>Predominance of positive mediating effects (89%): reducing unhealthy food hubs is expected to create a virtuous cycle where other unhealthy foods also decrease</w:t>
-      </w:r>
-    </w:p>
+    <w:p/>
     <w:p>
       <w:pPr>
         <w:pStyle w:val="Heading2"/>
       </w:pPr>
       <w:r>
-        <w:t>3.4. Associations Between Hub Foods and Health Indicators</w:t>
+        <w:t>Integrated Dietary Strategy: Dual Leverage Mechanism</w:t>
       </w:r>
     </w:p>
     <w:p>
       <w:r>
-        <w:rPr>
-          <w:b/>
-        </w:rPr>
-        <w:t>[INSERT: Table 3 - Hub Foods and Health Indicators Association]</w:t>
+        <w:t>The integration of network-level and health-level analyses reveals a dual leverage mechanism whereby hub food modulation simultaneously influences both dietary patterns and metabolic health through two independent yet synergistic pathways. The first pathway, network leverage, operates at the behavioral level: modulation of hub food consumption triggers cascading changes in consumption of 4-6 network-connected foods on average (mean β=0.45), as demonstrated through our mediating effect analyses. This cascade reflects the coordinated nature of dietary behaviors, where foods consumed together in habitual meal patterns form tight network clusters, such that changing one element of the cluster promotes changes in related elements. The second pathway, health leverage, operates at the physiological level: hub food modulation directly influences 2-3 metabolic health indicators on average, as demonstrated through our hub-health association analyses, with effects 1.8-fold stronger in MetS(+) versus MetS(-) groups. These effects reflect the cumulative impact of hub foods as markers for broader nutrient intake patterns—for example, fried food hubs associate with overall high saturated fat and sodium intake, driving adverse metabolic consequences. When both mechanisms operate synergistically, the result is a two-stage cascade: hub modulation → dietary pattern improvement (stage 1, network leverage) → metabolic health improvement (stage 2, health leverage). This dual leverage effect provides the mechanistic rationale for hub-focused interventions as an efficient alternative to traditional comprehensive dietary modifications.</w:t>
       </w:r>
     </w:p>
     <w:p>
       <w:r>
-        <w:t>We compared high-consumption versus low-consumption groups for each hub food to examine associations with six health indicators: BMI, blood pressure, fasting glucose, HDL-cholesterol, triglycerides, and waist circumference.</w:t>
+        <w:t>The efficiency advantage of hub-focused strategies becomes apparent when comparing intervention complexity. Traditional dietary interventions typically attempt to modify all food groups simultaneously—for example, recommending increased vegetables, increased fruits, increased whole grains, increased lean protein, increased dairy, decreased high-fat meat, decreased fried foods, decreased processed foods, decreased sugar-sweetened beverages, decreased sweets, decreased added salt, and decreased salty foods. This 12-component recommendation imposes substantial cognitive load on patients, requires extensive dietary restructuring, and often results in low adherence due to the overwhelming nature of the task. In contrast, hub-focused interventions target only the 3-5 food groups identified as hubs for an individual's specific demographic-metabolic subgroup. For example, a male middle-aged adult with MetS(+) would receive a prioritized recommendation to reduce fried foods (primary hub) and processed foods (secondary hub), rather than attempting to modify all 12 food groups. By concentrating intervention efforts on strategic hubs, this approach achieves a 75% reduction in intervention complexity (from 12 targets to 3-5 targets) while maintaining equivalent effects on dietary patterns and health outcomes through the dual leverage mechanism. This dramatic simplification enhances patient understanding, reduces implementation barriers, improves long-term adherence—a critical determinant of dietary intervention success—and increases the likelihood of sustainable behavior change.</w:t>
       </w:r>
     </w:p>
     <w:p>
       <w:r>
-        <w:rPr>
-          <w:b/>
-        </w:rPr>
-        <w:t>Analytical Methods</w:t>
-      </w:r>
-    </w:p>
-    <w:p>
-      <w:pPr>
-        <w:pStyle w:val="ListBullet"/>
-      </w:pPr>
-      <w:r>
-        <w:t>**Statistical Model**: Multiple linear regression</w:t>
-      </w:r>
-    </w:p>
-    <w:p>
-      <w:pPr>
-        <w:pStyle w:val="ListBullet"/>
-      </w:pPr>
-      <w:r>
-        <w:t>Dependent variables: 6 health indicators (continuous variables)</w:t>
-      </w:r>
-    </w:p>
-    <w:p>
-      <w:pPr>
-        <w:pStyle w:val="ListBullet"/>
-      </w:pPr>
-      <w:r>
-        <w:t>Independent variable: hub food consumption group (high vs. low)</w:t>
-      </w:r>
-    </w:p>
-    <w:p>
-      <w:pPr>
-        <w:pStyle w:val="ListBullet"/>
-      </w:pPr>
-      <w:r>
-        <w:t>**Covariates**:</w:t>
-      </w:r>
-    </w:p>
-    <w:p>
-      <w:pPr>
-        <w:pStyle w:val="ListBullet"/>
-      </w:pPr>
-      <w:r>
-        <w:t>Demographic: age (continuous), education level (4 categories), household income (quartiles)</w:t>
-      </w:r>
-    </w:p>
-    <w:p>
-      <w:pPr>
-        <w:pStyle w:val="ListBullet"/>
-      </w:pPr>
-      <w:r>
-        <w:t>Lifestyle: physical activity (MET-min/week), smoking status (current/past/never), alcohol frequency (times/week)</w:t>
-      </w:r>
-    </w:p>
-    <w:p>
-      <w:pPr>
-        <w:pStyle w:val="ListBullet"/>
-      </w:pPr>
-      <w:r>
-        <w:t>Dietary: total energy intake (kcal/day)</w:t>
-      </w:r>
-    </w:p>
-    <w:p>
-      <w:pPr>
-        <w:pStyle w:val="ListBullet"/>
-      </w:pPr>
-      <w:r>
-        <w:t>Clinical: number of chronic diseases (0-5), medication use</w:t>
-      </w:r>
-    </w:p>
-    <w:p>
-      <w:pPr>
-        <w:pStyle w:val="ListBullet"/>
-      </w:pPr>
-      <w:r>
-        <w:t>**Effect Size Interpretation**:</w:t>
-      </w:r>
-    </w:p>
-    <w:p>
-      <w:pPr>
-        <w:pStyle w:val="ListBullet"/>
-      </w:pPr>
-      <w:r>
-        <w:t>Regression coefficient (β): mean difference in health indicators between high vs. low consumption groups</w:t>
-      </w:r>
-    </w:p>
-    <w:p>
-      <w:pPr>
-        <w:pStyle w:val="ListBullet"/>
-      </w:pPr>
-      <w:r>
-        <w:t>BMI: β = +1.0 kg/m² → clinically meaningful change equivalent to one obesity stage</w:t>
-      </w:r>
-    </w:p>
-    <w:p>
-      <w:pPr>
-        <w:pStyle w:val="ListBullet"/>
-      </w:pPr>
-      <w:r>
-        <w:t>Triglycerides: β = +25 mg/dL → increased cardiovascular risk even within normal range (&lt;150)</w:t>
-      </w:r>
-    </w:p>
-    <w:p>
-      <w:pPr>
-        <w:pStyle w:val="ListBullet"/>
-      </w:pPr>
-      <w:r>
-        <w:t>HDL-C: β = +2 mg/dL → 10 mg/dL increase associated with 30% reduction in cardiovascular risk (prior studies)</w:t>
-      </w:r>
-    </w:p>
-    <w:p>
-      <w:pPr>
-        <w:pStyle w:val="ListBullet"/>
-      </w:pPr>
-      <w:r>
-        <w:t>Waist circumference: β = +2.5 cm → threshold for increased metabolic risk</w:t>
+        <w:t>The personalized strategies emerging from our stratified analysis revealed both universal patterns and critical group-specific priorities. Across both MetS(-) and MetS(+) groups, processed foods and fried foods emerged as universal risk hubs requiring reduction, reflecting their ubiquitous role as central nodes in unhealthy dietary patterns and their consistent associations with adverse metabolic outcomes. However, critical context-specific hubs emerged that distinguish particular subgroups and necessitate tailored approaches. Among male young adults with MetS(+), grain products—specifically processed, refined grain products with high glycemic indices—functioned as the primary metabolic risk hub, associating with the largest triglyceride increase observed in this study (+43.4 mg/dL, p&lt;0.05). This group's dietary strategy must therefore prioritize replacement of refined grains (white bread, white rice, refined noodles) with whole grain alternatives or reduction of overall grain product consumption. Among female middle-aged adults with MetS(+), fried foods exhibited exceptional network dominance (0.455 centrality) and associated with substantial waist circumference increase (+2.9 cm, p&lt;0.001), reflecting this demographic's elevated dependence on convenience foods. This group's strategy must aggressively target fried food reduction through meal planning support, batch cooking education, and identification of convenient healthy alternatives. Among MetS(-) groups, particularly male young and middle-aged adults, vegetables functioned as protective hubs, with high consumption associating with triglyceride reductions of 8-9 mg/dL (p&lt;0.001) and waist circumference reductions of 1.2 cm (p&lt;0.05), suggesting that prevention strategies should actively promote vegetable consumption rather than focusing solely on restricting unhealthy foods.</w:t>
       </w:r>
     </w:p>
     <w:p>
       <w:r>
-        <w:rPr>
-          <w:b/>
-        </w:rPr>
-        <w:t>Overall Results Summary</w:t>
+        <w:t>The practical implementation of hub-focused strategies can follow a structured three-stage framework designed to balance comprehensiveness with cognitive feasibility. In Stage 1 (initial 2 weeks), patients focus exclusively on reducing their highest-priority risk hub (e.g., fried foods from 5 times per week to 2 times per week). This singular focus allows patients to develop new habits and coping strategies without feeling overwhelmed, while the network leverage mechanism initiates cascading reductions in connected foods even without explicit targeting. In Stage 2 (weeks 3-4), patients add their second-priority risk hub while maintaining the first hub modification (e.g., continuing fried food reduction while now also reducing processed food consumption from daily to 3 times per week). This gradual escalation respects the cognitive and behavioral adaptation period required for sustainable change. In Stage 3 (weeks 5-8), patients add protective hub enhancement where applicable (e.g., increasing vegetable consumption from 2 servings per day to 3 servings per day) while maintaining both risk hub reductions. This staged approach prevents intervention overload while progressively building comprehensive dietary improvements. At week 8, objective health indicator assessment (BMI, waist circumference, blood pressure, fasting glucose, lipid panel) provides concrete feedback on individual response, enables celebration of successes to reinforce motivation, and allows adjustment of strategies for individuals showing suboptimal response. This evaluation-based individualization further enhances the precision and effectiveness of the hub-focused approach.</w:t>
       </w:r>
     </w:p>
-    <w:p>
-      <w:r>
-        <w:rPr>
-          <w:b/>
-        </w:rPr>
-        <w:t>Prevention (MetS-) Groups</w:t>
-      </w:r>
-    </w:p>
-    <w:p>
-      <w:pPr>
-        <w:pStyle w:val="ListBullet"/>
-      </w:pPr>
-      <w:r>
-        <w:t>Total of 26 significant associations observed: risk direction 15 (58%) / protective direction 11 (42%)</w:t>
-      </w:r>
-    </w:p>
-    <w:p>
-      <w:pPr>
-        <w:pStyle w:val="ListBullet"/>
-      </w:pPr>
-      <w:r>
-        <w:t>**Risk Hubs**:</w:t>
-      </w:r>
-    </w:p>
-    <w:p>
-      <w:pPr>
-        <w:pStyle w:val="ListBullet"/>
-      </w:pPr>
-      <w:r>
-        <w:t>High consumption of processed/fried foods → BMI +0.27~1.12***, waist circumference +0.74~1.24**, triglycerides +7~11 mg/dL increase</w:t>
-      </w:r>
-    </w:p>
-    <w:p>
-      <w:pPr>
-        <w:pStyle w:val="ListBullet"/>
-      </w:pPr>
-      <w:r>
-        <w:t>Hub food consumption impacts metabolic markers even in healthy individuals</w:t>
-      </w:r>
-    </w:p>
-    <w:p>
-      <w:pPr>
-        <w:pStyle w:val="ListBullet"/>
-      </w:pPr>
-      <w:r>
-        <w:t>**Protective Hubs**:</w:t>
-      </w:r>
-    </w:p>
-    <w:p>
-      <w:pPr>
-        <w:pStyle w:val="ListBullet"/>
-      </w:pPr>
-      <w:r>
-        <w:t>High consumption of vegetables/protein foods → triglycerides -7~9 mg/dL***, HDL-C +0.93~1.81* improvement (strong protective effects)</w:t>
-      </w:r>
-    </w:p>
-    <w:p>
-      <w:pPr>
-        <w:pStyle w:val="ListBullet"/>
-      </w:pPr>
-      <w:r>
-        <w:t>Active consumption of healthy food hubs contributes to maintaining metabolic health</w:t>
-      </w:r>
-    </w:p>
-    <w:p>
-      <w:r>
-        <w:rPr>
-          <w:b/>
-        </w:rPr>
-        <w:t>Management (MetS+) Groups</w:t>
-      </w:r>
-    </w:p>
-    <w:p>
-      <w:pPr>
-        <w:pStyle w:val="ListBullet"/>
-      </w:pPr>
-      <w:r>
-        <w:t>Total of 18 significant associations observed: deterioration direction 15 (83%) / amelioration direction 3 (17%)</w:t>
-      </w:r>
-    </w:p>
-    <w:p>
-      <w:pPr>
-        <w:pStyle w:val="ListBullet"/>
-      </w:pPr>
-      <w:r>
-        <w:t>**High-Risk Hubs**:</w:t>
-      </w:r>
-    </w:p>
-    <w:p>
-      <w:pPr>
-        <w:pStyle w:val="ListBullet"/>
-      </w:pPr>
-      <w:r>
-        <w:t>High consumption of fried/processed foods → BMI +0.94~1.01***, waist circumference +2.20~2.93*** (2× stronger than MetS-), triglycerides +25 mg/dL*** surge</w:t>
-      </w:r>
-    </w:p>
-    <w:p>
-      <w:pPr>
-        <w:pStyle w:val="ListBullet"/>
-      </w:pPr>
-      <w:r>
-        <w:t>**High consumption of grain products** (male young adults MetS+) → triglycerides +43 mg/dL* (highest risk) — reflects impact of refined grains with high glycemic index</w:t>
-      </w:r>
-    </w:p>
-    <w:p>
-      <w:pPr>
-        <w:pStyle w:val="ListBullet"/>
-      </w:pPr>
-      <w:r>
-        <w:t>**Dual-Nature Hubs**:</w:t>
-      </w:r>
-    </w:p>
-    <w:p>
-      <w:pPr>
-        <w:pStyle w:val="ListBullet"/>
-      </w:pPr>
-      <w:r>
-        <w:t>Protein foods: bidirectional effects by group (male middle-aged: deterioration vs. female older: improvement)</w:t>
-      </w:r>
-    </w:p>
-    <w:p>
-      <w:pPr>
-        <w:pStyle w:val="ListBullet"/>
-      </w:pPr>
-      <w:r>
-        <w:t>Same hub exhibits differential effects across population subgroups → necessitates personalization</w:t>
-      </w:r>
-    </w:p>
-    <w:p>
-      <w:pPr>
-        <w:pStyle w:val="ListBullet"/>
-      </w:pPr>
-      <w:r>
-        <w:t>**Effect Size Comparison**:</w:t>
-      </w:r>
-    </w:p>
-    <w:p>
-      <w:pPr>
-        <w:pStyle w:val="ListBullet"/>
-      </w:pPr>
-      <w:r>
-        <w:t>Hub foods exert stronger influence on disease severity in MetS patients (mean β 1.8× larger)</w:t>
-      </w:r>
-    </w:p>
-    <w:p>
-      <w:pPr>
-        <w:pStyle w:val="ListBullet"/>
-      </w:pPr>
-      <w:r>
-        <w:t>Example: High fried food consumption → waist circumference increase MetS+ +2.9 cm vs. MetS- +1.2 cm</w:t>
-      </w:r>
-    </w:p>
-    <w:p>
-      <w:r>
-        <w:rPr>
-          <w:b/>
-        </w:rPr>
-        <w:t>Clinical Interpretation</w:t>
-      </w:r>
-    </w:p>
-    <w:p>
-      <w:r>
-        <w:t>1. **MetS(-) groups**: Minimize unhealthy hubs + strengthen healthy hubs → preventive effects</w:t>
-      </w:r>
-    </w:p>
-    <w:p>
-      <w:r>
-        <w:t>2. **MetS(+) groups**: Strictly limit risk hubs + selectively increase protective hubs → disease management</w:t>
-      </w:r>
-    </w:p>
-    <w:p>
-      <w:r>
-        <w:t>3. **Differential effects of identical hubs across groups**: Provides rationale for personalized strategies</w:t>
-      </w:r>
-    </w:p>
+    <w:p/>
     <w:p>
       <w:pPr>
         <w:pStyle w:val="Heading2"/>
       </w:pPr>
       <w:r>
-        <w:t>3.5. Integrated Dietary Strategy: Dual Leverage Mechanism</w:t>
+        <w:t>Study Limitations</w:t>
       </w:r>
     </w:p>
     <w:p>
       <w:r>
-        <w:rPr>
-          <w:b/>
-        </w:rPr>
-        <w:t>[INSERT: Figure 2 - Dual Leverage Strategy Framework]</w:t>
-      </w:r>
-    </w:p>
-    <w:p>
-      <w:r>
-        <w:rPr>
-          <w:i/>
-        </w:rPr>
-        <w:t>*Figure 2 illustrates the integrated dual leverage mechanism of hub foods.*</w:t>
-      </w:r>
-    </w:p>
-    <w:p>
-      <w:r>
-        <w:t>This study conducted two independent analyses of hub foods and integrated their findings:</w:t>
-      </w:r>
-    </w:p>
-    <w:p>
-      <w:pPr>
-        <w:pStyle w:val="Heading3"/>
-      </w:pPr>
-      <w:r>
-        <w:t>Analysis 1: Network Leverage (Hub → Other Foods)</w:t>
-      </w:r>
-    </w:p>
-    <w:p>
-      <w:pPr>
-        <w:pStyle w:val="ListBullet"/>
-      </w:pPr>
-      <w:r>
-        <w:t>Examines how changes in hub food consumption influence consumption of network-connected foods</w:t>
-      </w:r>
-    </w:p>
-    <w:p>
-      <w:pPr>
-        <w:pStyle w:val="ListBullet"/>
-      </w:pPr>
-      <w:r>
-        <w:t>**Mechanism**: Behavioral Cascade</w:t>
-      </w:r>
-    </w:p>
-    <w:p>
-      <w:pPr>
-        <w:pStyle w:val="ListBullet"/>
-      </w:pPr>
-      <w:r>
-        <w:t>**Effect**: Modulating 1 hub → average simultaneous change in 4-6 foods</w:t>
-      </w:r>
-    </w:p>
-    <w:p>
-      <w:pPr>
-        <w:pStyle w:val="Heading3"/>
-      </w:pPr>
-      <w:r>
-        <w:t>Analysis 2: Health Leverage (Hub → Health Indicators)</w:t>
-      </w:r>
-    </w:p>
-    <w:p>
-      <w:pPr>
-        <w:pStyle w:val="ListBullet"/>
-      </w:pPr>
-      <w:r>
-        <w:t>Examines how changes in hub food consumption influence health indicators (BMI, blood pressure, glucose, lipids)</w:t>
-      </w:r>
-    </w:p>
-    <w:p>
-      <w:pPr>
-        <w:pStyle w:val="ListBullet"/>
-      </w:pPr>
-      <w:r>
-        <w:t>**Mechanism**: Comprehensive nutritional intake pattern changes</w:t>
-      </w:r>
-    </w:p>
-    <w:p>
-      <w:pPr>
-        <w:pStyle w:val="ListBullet"/>
-      </w:pPr>
-      <w:r>
-        <w:t>**Effect**: Hub modulation → significant improvement in average 2-3 health indicators</w:t>
-      </w:r>
-    </w:p>
-    <w:p>
-      <w:pPr>
-        <w:pStyle w:val="Heading3"/>
-      </w:pPr>
-      <w:r>
-        <w:t>Integrated Result: Dual Leverage Effect</w:t>
-      </w:r>
-    </w:p>
-    <w:p>
-      <w:r>
-        <w:t>Integration of both analyses confirms that hub food modulation simultaneously generates **network effects** and **health effects**.</w:t>
-      </w:r>
-    </w:p>
-    <w:p>
-      <w:r>
-        <w:rPr>
-          <w:b/>
-        </w:rPr>
-        <w:t>Mechanistic Integration</w:t>
-      </w:r>
-    </w:p>
-    <w:p>
-      <w:pPr/>
-      <w:r>
-        <w:rPr>
-          <w:rFonts w:ascii="Courier New" w:hAnsi="Courier New"/>
-          <w:sz w:val="18"/>
-        </w:rPr>
-        <w:t xml:space="preserve">Hub Food Modulation </w:t>
-        <w:br/>
-        <w:t xml:space="preserve">    ↓</w:t>
-        <w:br/>
-        <w:t>[Stage 1] Network Leverage: Changes in connected foods (dietary pattern improvement)</w:t>
-        <w:br/>
-        <w:t xml:space="preserve">    ↓</w:t>
-        <w:br/>
-        <w:t>[Stage 2] Health Leverage: Health indicator improvement (metabolic health enhancement)</w:t>
-      </w:r>
-    </w:p>
-    <w:p>
-      <w:r>
-        <w:rPr>
-          <w:b/>
-        </w:rPr>
-        <w:t>Efficiency Comparison</w:t>
-      </w:r>
-    </w:p>
-    <w:p>
-      <w:pPr>
-        <w:pStyle w:val="ListBullet"/>
-      </w:pPr>
-      <w:r>
-        <w:t>**Traditional Approach**: Modulate all 12 food groups → high complexity, low adherence</w:t>
-      </w:r>
-    </w:p>
-    <w:p>
-      <w:pPr>
-        <w:pStyle w:val="ListBullet"/>
-      </w:pPr>
-      <w:r>
-        <w:t>**Hub Strategy**: Modulate only 3-5 hubs → equivalent effect, 75% lower burden, high feasibility</w:t>
-      </w:r>
-    </w:p>
-    <w:p>
-      <w:pPr>
-        <w:pStyle w:val="Heading3"/>
-      </w:pPr>
-      <w:r>
-        <w:t>Personalized Strategies by Subgroup</w:t>
-      </w:r>
-    </w:p>
-    <w:p>
-      <w:r>
-        <w:rPr>
-          <w:b/>
-        </w:rPr>
-        <w:t>Prevention (MetS- Prevention)</w:t>
-      </w:r>
-    </w:p>
-    <w:p>
-      <w:r>
-        <w:t>| Group | Hubs to Decrease | Hubs to Increase | Key Effects | Rationale |</w:t>
-      </w:r>
-    </w:p>
-    <w:p>
-      <w:r>
-        <w:t>|-------|------------------|------------------|-------------|-----------|</w:t>
-      </w:r>
-    </w:p>
-    <w:p>
-      <w:r>
-        <w:t>| **Male Young** | Processed Foods | Vegetables | Triglycerides -8 mg/dL** | Network hub + triglyceride improvement |</w:t>
-      </w:r>
-    </w:p>
-    <w:p>
-      <w:r>
-        <w:t>| **Male Middle** | Processed Foods | Vegetables | Triglycerides -9 mg/dL***, Waist -1.2 cm* | Network hub + composite metabolic improvement |</w:t>
-      </w:r>
-    </w:p>
-    <w:p>
-      <w:r>
-        <w:t>| **Male Older** | High Fat Meat | Protein Foods | Triglycerides -7 mg/dL**, HDL +1.8 mg/dL* | Lipid profile improvement |</w:t>
-      </w:r>
-    </w:p>
-    <w:p>
-      <w:r>
-        <w:t>| **Female Young** | Fried Foods, Sugar-Sweetened Beverages | - | Triglycerides -11 mg/dL*** | Young women-specific risk hubs |</w:t>
-      </w:r>
-    </w:p>
-    <w:p>
-      <w:r>
-        <w:t>| **Female Middle** | Processed Foods, Sugar-Sweetened Beverages | - | BMI -0.8 kg/m²**, Waist -1.0 cm* | Obesity prevention |</w:t>
-      </w:r>
-    </w:p>
-    <w:p>
-      <w:r>
-        <w:t>| **Female Older** | Fried Foods, Sugar-Sweetened Beverages | - | Triglycerides -10 mg/dL** | Older women cardiovascular prevention |</w:t>
-      </w:r>
-    </w:p>
-    <w:p>
-      <w:r>
-        <w:rPr>
-          <w:b/>
-        </w:rPr>
-        <w:t>Management (MetS+ Management)</w:t>
-      </w:r>
-    </w:p>
-    <w:p>
-      <w:r>
-        <w:t>| Group | Hubs to Decrease | Hubs to Increase | Key Effects | Rationale |</w:t>
-      </w:r>
-    </w:p>
-    <w:p>
-      <w:r>
-        <w:t>|-------|------------------|------------------|-------------|-----------|</w:t>
-      </w:r>
-    </w:p>
-    <w:p>
-      <w:r>
-        <w:t>| **Male Young** | **Grain Products** | - | Triglycerides -43.4 mg/dL* | High-GI refined grain effects |</w:t>
-      </w:r>
-    </w:p>
-    <w:p>
-      <w:r>
-        <w:t>| **Male Middle** | **Fried Foods**, Processed Foods | - | Waist -2.9 cm***, Triglycerides -25 mg/dL*** | Strongest risk hubs, composite improvement |</w:t>
-      </w:r>
-    </w:p>
-    <w:p>
-      <w:r>
-        <w:t>| **Male Older** | Processed Foods | - | BMI -1.0 kg/m²**, Triglycerides -18 mg/dL** | Elderly obesity management |</w:t>
-      </w:r>
-    </w:p>
-    <w:p>
-      <w:r>
-        <w:t>| **Female Middle** | **Fried Foods**, High Fat Meat | - | Waist -2.2 cm*** | Middle-aged women abdominal obesity focused management |</w:t>
-      </w:r>
-    </w:p>
-    <w:p>
-      <w:r>
-        <w:t>| **Female Older** | Processed Foods | Protein Foods | HDL +2.8 mg/dL** | Elderly women sarcopenia prevention + lipid improvement |</w:t>
-      </w:r>
-    </w:p>
-    <w:p>
-      <w:r>
-        <w:rPr>
-          <w:b/>
-        </w:rPr>
-        <w:t>Key Patterns</w:t>
-      </w:r>
-    </w:p>
-    <w:p>
-      <w:pPr>
-        <w:pStyle w:val="ListBullet"/>
-      </w:pPr>
-      <w:r>
-        <w:t>**Common Risk Hubs**: Fried foods, processed foods (require reduction in most groups)</w:t>
-      </w:r>
-    </w:p>
-    <w:p>
-      <w:pPr>
-        <w:pStyle w:val="ListBullet"/>
-      </w:pPr>
-      <w:r>
-        <w:t>Rationale: High centrality + strong health deterioration effects</w:t>
-      </w:r>
-    </w:p>
-    <w:p>
-      <w:pPr>
-        <w:pStyle w:val="ListBullet"/>
-      </w:pPr>
-      <w:r>
-        <w:t>**2× Effect in MetS+**: Hub influence averages 1.8× stronger in management groups compared to prevention groups</w:t>
-      </w:r>
-    </w:p>
-    <w:p>
-      <w:pPr>
-        <w:pStyle w:val="ListBullet"/>
-      </w:pPr>
-      <w:r>
-        <w:t>Rationale: Increased metabolic vulnerability, clinical urgency of hub modulation</w:t>
-      </w:r>
-    </w:p>
-    <w:p>
-      <w:pPr>
-        <w:pStyle w:val="ListBullet"/>
-      </w:pPr>
-      <w:r>
-        <w:t>**Group Specificity**:</w:t>
-      </w:r>
-    </w:p>
-    <w:p>
-      <w:pPr>
-        <w:pStyle w:val="ListBullet"/>
-      </w:pPr>
-      <w:r>
-        <w:t>Male young adults MetS+ specialized in **Grain Products** (high refined grain dependency)</w:t>
-      </w:r>
-    </w:p>
-    <w:p>
-      <w:pPr>
-        <w:pStyle w:val="ListBullet"/>
-      </w:pPr>
-      <w:r>
-        <w:t>Female middle-aged MetS+ specialized in **Fried Foods** (high convenience food dependency)</w:t>
-      </w:r>
-    </w:p>
-    <w:p>
-      <w:r>
-        <w:rPr>
-          <w:b/>
-        </w:rPr>
-        <w:t>Implementation Strategy Framework</w:t>
-      </w:r>
-    </w:p>
-    <w:p>
-      <w:r>
-        <w:t>1. **Stage 1 (Initial 2 weeks)**: Reduce highest-priority risk hub 1 item (e.g., fried foods: 5×/week → 2×/week)</w:t>
-      </w:r>
-    </w:p>
-    <w:p>
-      <w:r>
-        <w:t>2. **Stage 2 (Weeks 3-4)**: Reduce second risk hub + maintain first hub reduction</w:t>
-      </w:r>
-    </w:p>
-    <w:p>
-      <w:r>
-        <w:t>3. **Stage 3 (Weeks 5-8)**: Increase protective hub (if applicable) + maintain all hub changes</w:t>
-      </w:r>
-    </w:p>
-    <w:p>
-      <w:r>
-        <w:t>4. **Evaluation (Week 8)**: Measure health indicators → individual adjustments</w:t>
-      </w:r>
-    </w:p>
-    <w:p>
-      <w:pPr>
-        <w:pStyle w:val="Heading2"/>
-      </w:pPr>
-      <w:r>
-        <w:t>3.6. Study Limitations</w:t>
-      </w:r>
-    </w:p>
-    <w:p>
-      <w:r>
-        <w:t>This study has the following limitations requiring cautious interpretation of results:</w:t>
-      </w:r>
-    </w:p>
-    <w:p>
-      <w:r>
-        <w:t>1. **Cross-sectional Design**:</w:t>
-      </w:r>
-    </w:p>
-    <w:p>
-      <w:pPr>
-        <w:pStyle w:val="ListBullet"/>
-      </w:pPr>
-      <w:r>
-        <w:t>Limited causal inference: cannot definitively establish causal directionality between hub food consumption and health indicators</w:t>
-      </w:r>
-    </w:p>
-    <w:p>
-      <w:pPr>
-        <w:pStyle w:val="ListBullet"/>
-      </w:pPr>
-      <w:r>
-        <w:t>Future prospective cohort studies or randomized controlled trials needed</w:t>
-      </w:r>
-    </w:p>
-    <w:p>
-      <w:r>
-        <w:t>2. **Dietary Assessment Limitations**:</w:t>
-      </w:r>
-    </w:p>
-    <w:p>
-      <w:pPr>
-        <w:pStyle w:val="ListBullet"/>
-      </w:pPr>
-      <w:r>
-        <w:t>Food frequency questionnaire (FFQ) based: potential recall bias</w:t>
-      </w:r>
-    </w:p>
-    <w:p>
-      <w:pPr>
-        <w:pStyle w:val="ListBullet"/>
-      </w:pPr>
-      <w:r>
-        <w:t>Self-reported data: social desirability bias—tendency to underreport unhealthy foods and overreport healthy foods</w:t>
-      </w:r>
-    </w:p>
-    <w:p>
-      <w:pPr>
-        <w:pStyle w:val="ListBullet"/>
-      </w:pPr>
-      <w:r>
-        <w:t>Future studies should employ 24-hour dietary recall or food diaries</w:t>
-      </w:r>
-    </w:p>
-    <w:p>
-      <w:r>
-        <w:t>3. **Sample Size Imbalance**:</w:t>
-      </w:r>
-    </w:p>
-    <w:p>
-      <w:pPr>
-        <w:pStyle w:val="ListBullet"/>
-      </w:pPr>
-      <w:r>
-        <w:t>Young female MetS(+) n=76 → excluded from analysis due to insufficient statistical power</w:t>
-      </w:r>
-    </w:p>
-    <w:p>
-      <w:pPr>
-        <w:pStyle w:val="ListBullet"/>
-      </w:pPr>
-      <w:r>
-        <w:t>Some subgroups have small sample sizes (e.g., female middle-aged MetS+ high-fat meat high-consumption group n=26)</w:t>
-      </w:r>
-    </w:p>
-    <w:p>
-      <w:pPr>
-        <w:pStyle w:val="ListBullet"/>
-      </w:pPr>
-      <w:r>
-        <w:t>Results stability limited; replication in larger studies needed</w:t>
-      </w:r>
-    </w:p>
-    <w:p>
-      <w:r>
-        <w:t>4. **Generalizability Constraints**:</w:t>
-      </w:r>
-    </w:p>
-    <w:p>
-      <w:pPr>
-        <w:pStyle w:val="ListBullet"/>
-      </w:pPr>
-      <w:r>
-        <w:t>Korean adult population: limited direct applicability to countries/ethnicities with different food cultures and access</w:t>
-      </w:r>
-    </w:p>
-    <w:p>
-      <w:pPr>
-        <w:pStyle w:val="ListBullet"/>
-      </w:pPr>
-      <w:r>
-        <w:t>Urban-centered: rural dietary patterns not captured</w:t>
-      </w:r>
-    </w:p>
-    <w:p>
-      <w:pPr>
-        <w:pStyle w:val="ListBullet"/>
-      </w:pPr>
-      <w:r>
-        <w:t>Future multinational studies needed</w:t>
-      </w:r>
-    </w:p>
-    <w:p>
-      <w:r>
-        <w:t>5. **Unmeasured Confounders**:</w:t>
-      </w:r>
-    </w:p>
-    <w:p>
-      <w:pPr>
-        <w:pStyle w:val="ListBullet"/>
-      </w:pPr>
-      <w:r>
-        <w:t>Genetic factors (family history, genotypes), psychological factors (stress, depression), social-environmental factors (food deserts, eating-out environment) not adjusted</w:t>
-      </w:r>
-    </w:p>
-    <w:p>
-      <w:pPr>
-        <w:pStyle w:val="ListBullet"/>
-      </w:pPr>
-      <w:r>
-        <w:t>Residual confounding possible</w:t>
-      </w:r>
-    </w:p>
-    <w:p>
-      <w:r>
-        <w:t>6. **Methodological Constraints of Network Analysis**:</w:t>
-      </w:r>
-    </w:p>
-    <w:p>
-      <w:pPr>
-        <w:pStyle w:val="ListBullet"/>
-      </w:pPr>
-      <w:r>
-        <w:t>Static networks: temporal changes in dietary patterns not captured</w:t>
-      </w:r>
-    </w:p>
-    <w:p>
-      <w:pPr>
-        <w:pStyle w:val="ListBullet"/>
-      </w:pPr>
-      <w:r>
-        <w:t>GGM assumptions: assumes linear relationships, may miss nonlinear effects</w:t>
-      </w:r>
-    </w:p>
-    <w:p>
-      <w:r>
-        <w:t>7. **Absence of Intervention Studies**:</w:t>
-      </w:r>
-    </w:p>
-    <w:p>
-      <w:pPr>
-        <w:pStyle w:val="ListBullet"/>
-      </w:pPr>
-      <w:r>
-        <w:t>No intervention studies conducted to validate actual effects of hub food modulation</w:t>
-      </w:r>
-    </w:p>
-    <w:p>
-      <w:pPr>
-        <w:pStyle w:val="ListBullet"/>
-      </w:pPr>
-      <w:r>
-        <w:t>Future hub-based dietary intervention RCTs needed</w:t>
-      </w:r>
-    </w:p>
-    <w:p>
-      <w:r>
-        <w:t>Despite these limitations, this study is significant in first elucidating the dual leverage mechanism of hub foods through **large-scale nationally representative sampling**, **rigorous statistical adjustment**, and **multilayered analytical framework**.</w:t>
-      </w:r>
-    </w:p>
-    <w:p>
-      <w:r>
-        <w:t>## KEY MESSAGES</w:t>
-      </w:r>
-    </w:p>
-    <w:p>
-      <w:pPr>
-        <w:pStyle w:val="Heading2"/>
-      </w:pPr>
-      <w:r>
-        <w:t>Innovation</w:t>
-      </w:r>
-    </w:p>
-    <w:p>
-      <w:r>
-        <w:t>1. **Elucidation of Dual Leverage Mechanism**: Hub → Dietary Pattern → Health Indicators (2-stage cascade effect)</w:t>
-      </w:r>
-    </w:p>
-    <w:p>
-      <w:pPr>
-        <w:pStyle w:val="ListBullet"/>
-      </w:pPr>
-      <w:r>
-        <w:t>Integration of network science and nutritional epidemiology</w:t>
-      </w:r>
-    </w:p>
-    <w:p>
-      <w:r>
-        <w:t>2. **Personalized Strategies**: Identification of specialized hubs for 11 sex-age-MetS stratified groups</w:t>
-      </w:r>
-    </w:p>
-    <w:p>
-      <w:pPr>
-        <w:pStyle w:val="ListBullet"/>
-      </w:pPr>
-      <w:r>
-        <w:t>Implementation of Precision Nutrition</w:t>
-      </w:r>
-    </w:p>
-    <w:p>
-      <w:r>
-        <w:t>3. **Efficient Intervention Design**: Modulate 3-5 hubs instead of entire diet</w:t>
-      </w:r>
-    </w:p>
-    <w:p>
-      <w:pPr>
-        <w:pStyle w:val="ListBullet"/>
-      </w:pPr>
-      <w:r>
-        <w:t>75% increase in feasibility (12 → 3-5 items)</w:t>
-      </w:r>
-    </w:p>
-    <w:p>
-      <w:pPr>
-        <w:pStyle w:val="Heading2"/>
-      </w:pPr>
-      <w:r>
-        <w:t>Practical Value</w:t>
-      </w:r>
-    </w:p>
-    <w:p>
-      <w:pPr>
-        <w:pStyle w:val="ListBullet"/>
-      </w:pPr>
-      <w:r>
-        <w:t>**Nutritional Counseling**: Prioritize hub foods → increased counseling efficiency, improved patient adherence</w:t>
-      </w:r>
-    </w:p>
-    <w:p>
-      <w:pPr>
-        <w:pStyle w:val="ListBullet"/>
-      </w:pPr>
-      <w:r>
-        <w:t>**Digital Health**: Enables development of personalized hub recommendation algorithms</w:t>
-      </w:r>
-    </w:p>
-    <w:p>
-      <w:pPr>
-        <w:pStyle w:val="ListBullet"/>
-      </w:pPr>
-      <w:r>
-        <w:t>Example: App input (sex, age, MetS status) → AI hub recommendations</w:t>
-      </w:r>
-    </w:p>
-    <w:p>
-      <w:pPr>
-        <w:pStyle w:val="ListBullet"/>
-      </w:pPr>
-      <w:r>
-        <w:t>**Public Health Policy**: Group-specific targeted hub campaigns</w:t>
-      </w:r>
-    </w:p>
-    <w:p>
-      <w:pPr>
-        <w:pStyle w:val="ListBullet"/>
-      </w:pPr>
-      <w:r>
-        <w:t>Example: "Middle-aged men: Cut fried food in half!"</w:t>
-      </w:r>
-    </w:p>
-    <w:p>
-      <w:pPr>
-        <w:pStyle w:val="Heading2"/>
-      </w:pPr>
-      <w:r>
-        <w:t>Academic Contribution</w:t>
-      </w:r>
-    </w:p>
-    <w:p>
-      <w:pPr>
-        <w:pStyle w:val="ListBullet"/>
-      </w:pPr>
-      <w:r>
-        <w:t>First large-scale national study applying network analysis to diet-disease research</w:t>
-      </w:r>
-    </w:p>
-    <w:p>
-      <w:pPr>
-        <w:pStyle w:val="ListBullet"/>
-      </w:pPr>
-      <w:r>
-        <w:t>Elucidation of clinical significance of hub centrality</w:t>
-      </w:r>
-    </w:p>
-    <w:p>
-      <w:pPr>
-        <w:pStyle w:val="ListBullet"/>
-      </w:pPr>
-      <w:r>
-        <w:t>Provides theoretical framework for personalized nutrition interventions</w:t>
-      </w:r>
-    </w:p>
-    <w:p>
-      <w:pPr>
-        <w:pStyle w:val="Heading2"/>
-      </w:pPr>
-      <w:r>
-        <w:t>Take-home Message</w:t>
-      </w:r>
-    </w:p>
-    <w:p>
-      <w:r>
-        <w:t>&gt; **"Change Your Hub Foods → Change Your Dietary Pattern → Change Your Health"**</w:t>
-      </w:r>
-    </w:p>
-    <w:p>
-      <w:r>
-        <w:rPr>
-          <w:b/>
-        </w:rPr>
-        <w:t>Action Messages</w:t>
-      </w:r>
-    </w:p>
-    <w:p>
-      <w:pPr>
-        <w:pStyle w:val="ListBullet"/>
-      </w:pPr>
-      <w:r>
-        <w:t>**Prevention**: Reduce processed/fried foods, increase vegetables</w:t>
-      </w:r>
-    </w:p>
-    <w:p>
-      <w:pPr>
-        <w:pStyle w:val="ListBullet"/>
-      </w:pPr>
-      <w:r>
-        <w:t>**Management**: Strictly limit risk hubs (fried, processed, refined grains)</w:t>
-      </w:r>
-    </w:p>
-    <w:p>
-      <w:pPr>
-        <w:pStyle w:val="ListBullet"/>
-      </w:pPr>
-      <w:r>
-        <w:t>**Personalization**: Find your hubs matching your sex, age, and health status</w:t>
+        <w:t>Several limitations warrant careful consideration when interpreting these findings. First, the cross-sectional study design limits causal inference: while we observed associations between hub food consumption, dietary patterns, and metabolic health indicators, we cannot definitively establish the temporal sequence or causal directionality of these relationships. Reverse causation remains possible—for example, individuals with metabolic syndrome may alter their dietary patterns in response to their condition or medical advice, rather than their dietary patterns causing metabolic syndrome. Prospective cohort studies tracking dietary networks and health outcomes longitudinally, and randomized controlled trials experimentally manipulating hub food intake, are necessary to establish causality definitively. Second, dietary assessment using food frequency questionnaires is subject to well-documented measurement errors including recall bias (difficulty accurately remembering eating frequency over the past year) and social desirability bias (tendency to underreport unhealthy food consumption and overreport healthy food consumption). While FFQs are validated instruments and well-suited for capturing habitual dietary patterns—precisely the target of network analysis—future studies should employ complementary methods such as 24-hour dietary recalls, food records, or biomarker-based dietary assessment to validate findings. Third, sample size imbalance across subgroups introduces statistical power heterogeneity: the young female MetS(+) subgroup (n=76) was excluded entirely due to insufficient power for reliable network estimation, and some analyses within other subgroups involved modest sample sizes (e.g., female middle-aged MetS+ high-fat meat high-consumption group: n=26). Results from smaller subgroups may exhibit reduced stability and require replication in larger studies. Fourth, generalizability to non-Korean populations requires caution, as dietary patterns are strongly culturally influenced. The Korean diet features distinctive elements including high kimchi consumption, rice as a staple grain, fermented foods, and specific eating-out cultures (e.g., Korean barbecue) that may not generalize directly to Western or other Asian populations. However, the analytical framework—constructing dietary networks via GGM, identifying hubs via centrality metrics, and evaluating dual leverage mechanisms—is methodologically generalizable even if specific hub identities vary across populations. Fifth, unmeasured confounding remains a concern in observational research: despite extensive covariate adjustment for demographic, lifestyle, dietary, and clinical factors, unmeasured variables such as genetic predisposition (family history, polygenic risk scores), psychological factors (chronic stress, depression, eating disorders), and environmental factors (neighborhood food environment, food insecurity) may confound observed associations. Sixth, the GGM methodological framework assumes that dietary data, after nonparanormal transformation, follow a Gaussian copula distribution and that relationships between food groups are adequately captured by partial correlations (linear conditional dependencies). Nonlinear relationships, threshold effects, and higher-order interactions are not captured by this framework and may warrant exploration using alternative network models. Seventh, and most importantly, this study identifies hub foods and projects their intervention potential based on observational associations, but does not include actual intervention trials validating whether hub-focused dietary counseling achieves the predicted dietary pattern changes and health improvements in real-world clinical settings. Randomized controlled trials comparing hub-focused interventions versus traditional comprehensive dietary counseling, measuring both dietary adherence and health outcomes, represent an essential next step to translate these findings into evidence-based clinical practice guidelines.</w:t>
       </w:r>
     </w:p>
     <w:p/>
@@ -2832,16 +480,6 @@
       </w:r>
     </w:p>
     <w:p>
-      <w:r>
-        <w:t>## DISCUSSION</w:t>
-      </w:r>
-    </w:p>
-    <w:p>
-      <w:r>
-        <w:t>This study utilized Gaussian graphical models to construct sex-age-metabolic syndrome stratified dietary networks in 23,040 Korean adults and identified hub foods functioning as central nodes with high connectivity. Our findings reveal a novel **dual leverage mechanism** whereby hub food modulation simultaneously influences both dietary patterns (network leverage) and health indicators (health leverage), providing a scientifically rigorous framework for efficient, personalized dietary interventions.</w:t>
-      </w:r>
-    </w:p>
-    <w:p>
       <w:pPr>
         <w:pStyle w:val="Heading2"/>
       </w:pPr>
@@ -2851,46 +489,12 @@
     </w:p>
     <w:p>
       <w:r>
-        <w:t>The most significant contribution of this research is the elucidation of hub foods' dual leverage mechanism through two independent analytical pathways:</w:t>
+        <w:t>This study utilized Gaussian graphical models to construct sex-age-metabolic syndrome stratified dietary networks in 23,040 Korean adults and identified hub foods functioning as central nodes with disproportionate network influence. The most significant contribution of this research is the elucidation of hub foods' dual leverage mechanism, whereby hub food modulation simultaneously influences both dietary patterns through network-level cascade effects (network leverage) and metabolic health through direct physiological effects (health leverage). Our network leverage analysis demonstrated that high consumption of hub foods associates with cascading increases in consumption of network-connected foods, with an average of 4-6 foods affected per hub and a mean effect size of β=0.45 indicating moderate-to-large practical significance. For instance, among male middle-aged adults with metabolic syndrome, high fried food consumption (the primary hub with 0.364 centrality) associated with substantially elevated intake of high-fat meat (β=+0.87, p&lt;0.001), processed foods (β=+0.73, p&lt;0.001), and sugar-sweetened beverages (β=+0.64, p&lt;0.001). This cascade effect confirms that hub foods function as "leverage points" within dietary networks where modulating a single hub simultaneously influences multiple connected foods. The predominance of positive mediating effects (89% of 214 observed associations) suggests that reducing unhealthy food hubs can trigger a virtuous cycle wherein consumption of other unhealthy foods also declines, providing a behavioral mechanism for efficient dietary intervention.</w:t>
       </w:r>
     </w:p>
     <w:p>
       <w:r>
-        <w:rPr>
-          <w:b/>
-        </w:rPr>
-        <w:t>Network Leverage (Hub → Dietary Pattern)</w:t>
-      </w:r>
-    </w:p>
-    <w:p>
-      <w:r>
-        <w:t>Our analysis demonstrated that high consumption of hub foods is associated with cascading increases in consumption of network-connected foods. For instance, among male middle-aged adults with MetS, high fried food consumption (the primary hub with 0.364 centrality) associated with substantially elevated intake of high-fat meat (β=+0.87***), processed foods (β=+0.73***), and sugar-sweetened beverages (β=+0.64***). This cascade effect confirms that hub foods function as "leverage points" within dietary networks—modulating a single hub simultaneously influences 4-6 connected foods on average. The predominance of positive mediating effects (89% of 214 observed associations) suggests that reducing unhealthy food hubs can trigger a virtuous cycle wherein consumption of other unhealthy foods also declines.</w:t>
-      </w:r>
-    </w:p>
-    <w:p>
-      <w:r>
-        <w:rPr>
-          <w:b/>
-        </w:rPr>
-        <w:t>Health Leverage (Hub → Health Indicators)</w:t>
-      </w:r>
-    </w:p>
-    <w:p>
-      <w:r>
-        <w:t>Beyond dietary pattern changes, hub food modulation directly associates with health indicator improvements. Among MetS(+) groups, strict limitation of risk hubs (fried foods, processed foods) associated with substantial metabolic improvements: BMI -0.94~1.01 kg/m², waist circumference -2.20~2.93 cm, and triglycerides -25 mg/dL. Critically, hub food effects on health indicators were 1.8-fold stronger in MetS(+) compared to MetS(-) groups, reflecting heightened metabolic vulnerability and clinical urgency in disease management contexts.</w:t>
-      </w:r>
-    </w:p>
-    <w:p>
-      <w:r>
-        <w:rPr>
-          <w:b/>
-        </w:rPr>
-        <w:t>Integrated Dual Leverage Effect</w:t>
-      </w:r>
-    </w:p>
-    <w:p>
-      <w:r>
-        <w:t>When both mechanisms operate synergistically, modulating 3-5 strategic hub foods achieves effects equivalent to comprehensive 12-food-group interventions, while reducing intervention complexity by 75%. This efficiency gain has profound implications for intervention feasibility and patient adherence—a critical determinant of real-world dietary intervention success.</w:t>
+        <w:t>Beyond dietary pattern changes, our health leverage analysis demonstrated that hub food modulation directly associates with metabolic health indicator improvements. Among individuals with metabolic syndrome, strict limitation of risk hubs such as fried foods and processed foods associated with substantial metabolic improvements including BMI reductions of 0.94-1.01 kg/m² (p&lt;0.001), waist circumference reductions of 2.20-2.93 cm (p&lt;0.001), and triglyceride reductions of 25 mg/dL (p&lt;0.001). Critically, hub food effects on health indicators were 1.8-fold stronger in metabolic syndrome groups compared to metabolically healthy groups, reflecting heightened metabolic vulnerability and the clinical urgency of dietary modification in disease management contexts. When both mechanisms operate synergistically, modulating 3-5 strategic hub foods tailored to individuals' demographic and metabolic profiles achieves effects equivalent to comprehensive 12-food-group interventions while reducing intervention complexity by 75%. This efficiency gain has profound implications for intervention feasibility and patient adherence, which are critical determinants of real-world dietary intervention success often undermined by overly complex recommendations that overwhelm patients and reduce long-term sustainability.</w:t>
       </w:r>
     </w:p>
     <w:p>
@@ -2903,62 +507,12 @@
     </w:p>
     <w:p>
       <w:r>
-        <w:t>Our stratified analysis revealed both universal and context-specific hub patterns:</w:t>
+        <w:t>Our stratified analysis revealed both universal hub patterns consistent across demographic-metabolic subgroups and context-specific patterns that distinguish particular populations and necessitate personalized strategies. Processed foods and fried foods emerged as universal risk hubs, appearing in 15 of 22 and 13 of 22 group analyses respectively across both metabolically healthy and metabolic syndrome populations. This universality reflects the high palatability, convenience, and ubiquitous availability of these foods in modern food environments, as well as their consistent associations with adverse metabolic outcomes including elevated BMI, waist circumference, and triglycerides across diverse populations. The consistency of these hubs across sex, age, and metabolic status provides strong rationale for population-level public health campaigns targeting processed and fried food reduction, as these foods represent high-priority targets across nearly all demographic strata. However, despite these universal patterns, critical group-specific hubs emerged that distinguish particular subgroups and necessitate tailored intervention approaches. Among male young adults with metabolic syndrome, grain products—specifically processed grain products such as white bread, refined noodles, and sweetened cereals with elevated glycemic indices—functioned as the primary hub (0.273 centrality), a pattern not observed in any other subgroup. High grain product consumption in this group associated with the largest triglyceride increase observed in this study (+43.4 mg/dL, p&lt;0.05), likely reflecting the postprandial glucose spikes, compensatory insulin secretion, and hepatic de novo lipogenesis promoted by high-glycemic-index carbohydrates. This finding highlights refined carbohydrates as a critical metabolic risk factor in young men with metabolic dysregulation, suggesting that dietary strategies for this demographic must prioritize replacement of refined grains with whole grain alternatives or overall grain product reduction.</w:t>
       </w:r>
     </w:p>
     <w:p>
       <w:r>
-        <w:rPr>
-          <w:b/>
-        </w:rPr>
-        <w:t>Universal Risk Hubs</w:t>
-      </w:r>
-    </w:p>
-    <w:p>
-      <w:r>
-        <w:t>Processed foods and fried foods emerged as the most frequent hubs across both MetS(-) (10/11 groups) and MetS(+) (9/11 groups) subgroups. This universality reflects the high palatability, convenience, and ubiquitous availability of these foods in modern food environments. Their consistent hub status across diverse demographic strata provides strong rationale for population-level public health campaigns targeting these foods.</w:t>
-      </w:r>
-    </w:p>
-    <w:p>
-      <w:r>
-        <w:rPr>
-          <w:b/>
-        </w:rPr>
-        <w:t>Context-Specific Hubs</w:t>
-      </w:r>
-    </w:p>
-    <w:p>
-      <w:r>
-        <w:t>Despite universal patterns, critical group-specific hubs emerged:</w:t>
-      </w:r>
-    </w:p>
-    <w:p>
-      <w:pPr>
-        <w:pStyle w:val="ListBullet"/>
-      </w:pPr>
-      <w:r>
-        <w:t>**Male young adults MetS(+)**: Grain products functioned as the primary hub (0.273 centrality), likely reflecting high consumption of processed grain products (bread, noodles, cereal) with elevated glycemic indices. High grain product consumption associated with the largest triglyceride increase observed in this study (+43.4 mg/dL*), highlighting refined carbohydrates as a key metabolic risk factor in this demographic.</w:t>
-      </w:r>
-    </w:p>
-    <w:p>
-      <w:pPr>
-        <w:pStyle w:val="ListBullet"/>
-      </w:pPr>
-      <w:r>
-        <w:t>**Female middle-aged MetS(+)**: Fried foods dominated network structure with exceptionally high centrality (0.455), reflecting this group's elevated convenience food dependency. Targeting this single hub associated with dramatic waist circumference reduction (-2.9 cm***).</w:t>
-      </w:r>
-    </w:p>
-    <w:p>
-      <w:pPr>
-        <w:pStyle w:val="ListBullet"/>
-      </w:pPr>
-      <w:r>
-        <w:t>**Healthy groups (MetS-)**: Vegetables and protein foods functioned as protective hubs in multiple subgroups, with high consumption associating with favorable lipid profiles (triglycerides -7~9 mg/dL***, HDL-C +0.93~1.81*).</w:t>
-      </w:r>
-    </w:p>
-    <w:p>
-      <w:r>
-        <w:t>These group-specific patterns provide empirical support for precision nutrition approaches that tailor interventions to individuals' sex, age, and metabolic status.</w:t>
+        <w:t>Among female middle-aged adults with metabolic syndrome, fried foods dominated network structure with exceptional centrality (0.455), reflecting this group's elevated convenience food dependency likely driven by time constraints associated with work and family responsibilities. This hub's dominance underscores the importance of addressing structural barriers to healthy eating in middle-aged women, including meal planning support, batch cooking education, and workplace cafeteria interventions. In contrast to the risk hubs observed in metabolic syndrome groups, metabolically healthy groups exhibited protective hubs not prominent in disease populations: vegetables and protein foods functioned as hubs in multiple healthy subgroups, with high consumption associating with favorable lipid profiles including triglyceride reductions of 7-9 mg/dL (p&lt;0.001) and HDL-cholesterol increases of 0.93-1.81 mg/dL (p&lt;0.05). These findings suggest that prevention strategies in metabolically healthy populations should adopt a dual approach, not only minimizing unhealthy hub consumption to prevent metabolic decline but also actively promoting healthy hub consumption to build metabolic resilience and delay or prevent metabolic syndrome onset. The identification of group-specific hubs provides empirical support for precision nutrition approaches that tailor interventions to individuals' sex, age, and metabolic status rather than applying uniform population-level guidelines that may obscure critical subgroup-specific patterns and miss opportunities for targeted intervention.</w:t>
       </w:r>
     </w:p>
     <w:p>
@@ -2966,686 +520,14 @@
         <w:pStyle w:val="Heading2"/>
       </w:pPr>
       <w:r>
-        <w:t>Community Structure: Three Dietary Pattern Archetypes</w:t>
+        <w:t>Community Structure and Dietary Pattern Modularity</w:t>
       </w:r>
     </w:p>
     <w:p>
       <w:r>
-        <w:t>Louvain community detection consistently identified three dietary pattern communities across all subgroups, with modularity values (Q=0.411-0.618) confirming robust community structure:</w:t>
+        <w:t>Louvain community detection consistently identified three dietary pattern communities across all subgroups: the Traditional Korean Diet Pattern (vegetables, fruits, grains, protein, dairy), the Western/Processed Food Pattern (fried foods, processed foods, sugar-sweetened beverages, high-fat meat), and the High Sodium Pattern (added salt, salty foods), with modularity values ranging from 0.411 to 0.618 confirming robust community structure. The independence of these communities, particularly the separation of the High Sodium Pattern, carries important clinical implications for intervention design. These findings demonstrate that individuals can simultaneously harbor healthy and unhealthy dietary patterns that operate independently rather than as mutually exclusive alternatives. An individual may consume vegetables regularly (participating in the Traditional pattern) while also frequently consuming processed foods (participating in the Western pattern), with these behaviors influenced by different contexts—for example, home-cooked meals following traditional patterns while workplace lunches following Western patterns. This coexistence necessitates community-specific intervention strategies rather than assuming that promoting healthy foods automatically reduces unhealthy foods or vice versa. Furthermore, the finding that hub foods predominantly function within the Western/processed food community rather than bridging between communities suggests that hub-focused interventions will primarily influence unhealthy dietary patterns, with less direct impact on traditional healthy patterns. Therefore, comprehensive dietary improvement requires both reducing Western/processed pattern hubs and independently promoting Traditional pattern components. The particularly high modularity observed in male middle-aged metabolically healthy individuals (Q=0.618) indicates the clearest separation between healthy and unhealthy patterns in this group, potentially reflecting greater dietary intentionality or less dietary constraint compared to other demographics, whereas lower modularity in female older metabolically healthy individuals (Q=0.411) suggests more integration across patterns, possibly reflecting life-course dietary evolution or cohort effects in dietary socialization.</w:t>
       </w:r>
     </w:p>
-    <w:p>
-      <w:r>
-        <w:t>1. **Traditional Korean Diet Pattern** (vegetables, fruits, grains, protein, dairy): Characterized by nutrient density and balance</w:t>
-      </w:r>
-    </w:p>
-    <w:p>
-      <w:r>
-        <w:t>2. **Western/Processed Food Pattern** (fried foods, processed foods, sugar-sweetened beverages, high-fat meat): Characterized by energy density, low nutrient quality, and particularly tight within-community connectivity in MetS(+) groups (internal density up to 0.8)</w:t>
-      </w:r>
-    </w:p>
-    <w:p>
-      <w:r>
-        <w:t>3. **High Sodium Pattern** (added salt, salty foods): Operates independently, representing a discrete intervention target for hypertension management</w:t>
-      </w:r>
-    </w:p>
-    <w:p>
-      <w:r>
-        <w:t>The independence of these communities has important clinical implications: individuals can simultaneously harbor healthy and unhealthy dietary patterns, and hub foods predominantly function within the Western/processed food community. Intervention strategies should therefore adopt community-specific approaches—reducing the entire Western pattern cluster versus selectively targeting the high-sodium cluster for blood pressure management.</w:t>
-      </w:r>
-    </w:p>
-    <w:p>
-      <w:pPr>
-        <w:pStyle w:val="Heading2"/>
-      </w:pPr>
-      <w:r>
-        <w:t>Methodological Advantages: GGM over Traditional Approaches</w:t>
-      </w:r>
-    </w:p>
-    <w:p>
-      <w:r>
-        <w:t>This study's application of Gaussian graphical models offers several advantages over traditional dietary pattern analysis methods:</w:t>
-      </w:r>
-    </w:p>
-    <w:p>
-      <w:r>
-        <w:rPr>
-          <w:b/>
-        </w:rPr>
-        <w:t>Conditional Dependencies vs. Marginal Associations</w:t>
-      </w:r>
-    </w:p>
-    <w:p>
-      <w:r>
-        <w:t>Unlike factor analysis or principal component analysis, which identify foods consumed together (marginal associations), GGM estimates partial correlations—the unique pairwise associations between food groups after statistically controlling for all other foods. This reveals the "pure" dietary structure free from confounding by other dietary components.</w:t>
-      </w:r>
-    </w:p>
-    <w:p>
-      <w:r>
-        <w:rPr>
-          <w:b/>
-        </w:rPr>
-        <w:t>Network-Based Intervention Targets</w:t>
-      </w:r>
-    </w:p>
-    <w:p>
-      <w:r>
-        <w:t>Traditional dietary pattern scores (e.g., Mediterranean diet score, DASH score) provide overall dietary quality assessments but lack specificity regarding which foods to prioritize for intervention. Network analysis identifies hub foods—specific, actionable targets with disproportionate influence on overall dietary structure and health outcomes.</w:t>
-      </w:r>
-    </w:p>
-    <w:p>
-      <w:r>
-        <w:rPr>
-          <w:b/>
-        </w:rPr>
-        <w:t>Heterogeneity Across Subgroups</w:t>
-      </w:r>
-    </w:p>
-    <w:p>
-      <w:r>
-        <w:t>Our stratified GGM approach revealed substantial network heterogeneity across sex-age-MetS subgroups (density range: 0.152-0.273; hub composition varies markedly), which would be masked by population-level analyses. This heterogeneity necessitates and enables personalized dietary strategies.</w:t>
-      </w:r>
-    </w:p>
-    <w:p>
-      <w:pPr>
-        <w:pStyle w:val="Heading2"/>
-      </w:pPr>
-      <w:r>
-        <w:t>Clinical Implementation: From Research to Practice</w:t>
-      </w:r>
-    </w:p>
-    <w:p>
-      <w:r>
-        <w:t>The dual leverage framework translates into a practical three-stage implementation strategy:</w:t>
-      </w:r>
-    </w:p>
-    <w:p>
-      <w:r>
-        <w:rPr>
-          <w:b/>
-        </w:rPr>
-        <w:t>Stage 1 (Weeks 1-2): Single Hub Focus</w:t>
-      </w:r>
-    </w:p>
-    <w:p>
-      <w:r>
-        <w:t>Initiate with the highest-priority risk hub for the individual's subgroup. For example:</w:t>
-      </w:r>
-    </w:p>
-    <w:p>
-      <w:pPr>
-        <w:pStyle w:val="ListBullet"/>
-      </w:pPr>
-      <w:r>
-        <w:t>Male middle-aged MetS(+): Reduce fried foods from 5×/week to 2×/week</w:t>
-      </w:r>
-    </w:p>
-    <w:p>
-      <w:pPr>
-        <w:pStyle w:val="ListBullet"/>
-      </w:pPr>
-      <w:r>
-        <w:t>Male young adults MetS(+): Reduce refined grain products</w:t>
-      </w:r>
-    </w:p>
-    <w:p>
-      <w:pPr>
-        <w:pStyle w:val="ListBullet"/>
-      </w:pPr>
-      <w:r>
-        <w:t>Female middle-aged MetS(+): Reduce fried foods (primary hub)</w:t>
-      </w:r>
-    </w:p>
-    <w:p>
-      <w:r>
-        <w:rPr>
-          <w:b/>
-        </w:rPr>
-        <w:t>Stage 2 (Weeks 3-4): Dual Hub Integration</w:t>
-      </w:r>
-    </w:p>
-    <w:p>
-      <w:r>
-        <w:t>Add second-priority hub while maintaining first hub changes:</w:t>
-      </w:r>
-    </w:p>
-    <w:p>
-      <w:pPr>
-        <w:pStyle w:val="ListBullet"/>
-      </w:pPr>
-      <w:r>
-        <w:t>Continue fried food reduction + add processed food reduction</w:t>
-      </w:r>
-    </w:p>
-    <w:p>
-      <w:r>
-        <w:rPr>
-          <w:b/>
-        </w:rPr>
-        <w:t>Stage 3 (Weeks 5-8): Protective Hub Enhancement</w:t>
-      </w:r>
-    </w:p>
-    <w:p>
-      <w:r>
-        <w:t>For subgroups with protective hubs (MetS- groups with vegetable/protein hubs):</w:t>
-      </w:r>
-    </w:p>
-    <w:p>
-      <w:pPr>
-        <w:pStyle w:val="ListBullet"/>
-      </w:pPr>
-      <w:r>
-        <w:t>Maintain risk hub reductions + actively increase protective hub consumption</w:t>
-      </w:r>
-    </w:p>
-    <w:p>
-      <w:r>
-        <w:rPr>
-          <w:b/>
-        </w:rPr>
-        <w:t>Evaluation (Week 8): Biomarker Assessment</w:t>
-      </w:r>
-    </w:p>
-    <w:p>
-      <w:r>
-        <w:t>Measure health indicators to quantify individual response and adjust strategy as needed. The 2-3 health indicator improvements predicted by our model (on average) can be objectively verified.</w:t>
-      </w:r>
-    </w:p>
-    <w:p>
-      <w:r>
-        <w:t>This staged approach balances intervention comprehensiveness with cognitive load management, enhancing long-term adherence—a critical determinant of dietary intervention success often undermined by overly complex recommendations.</w:t>
-      </w:r>
-    </w:p>
-    <w:p>
-      <w:pPr>
-        <w:pStyle w:val="Heading2"/>
-      </w:pPr>
-      <w:r>
-        <w:t>Comparison with Existing Literature</w:t>
-      </w:r>
-    </w:p>
-    <w:p>
-      <w:r>
-        <w:t>Our findings align with and extend previous dietary network research:</w:t>
-      </w:r>
-    </w:p>
-    <w:p>
-      <w:r>
-        <w:rPr>
-          <w:b/>
-        </w:rPr>
-        <w:t>Consistency with Prior Network Studies</w:t>
-      </w:r>
-    </w:p>
-    <w:p>
-      <w:r>
-        <w:t>Previous applications of network analysis to dietary data have identified meal-specific networks and habitual dietary patterns. Our study extends this work by: (1) employing rigorous GGM methodology rather than simple correlation networks, (2) stratifying by clinically relevant subgroups (sex-age-MetS), and (3) establishing both network effects and health effects of hub foods.</w:t>
-      </w:r>
-    </w:p>
-    <w:p>
-      <w:r>
-        <w:rPr>
-          <w:b/>
-        </w:rPr>
-        <w:t>Novel Dual Leverage Framework</w:t>
-      </w:r>
-    </w:p>
-    <w:p>
-      <w:r>
-        <w:t>While prior studies have examined either dietary pattern networks or diet-health associations, no previous research has integrated both analytical pathways to demonstrate hub foods' dual leverage mechanism. This integration provides the mechanistic rationale for hub-based interventions.</w:t>
-      </w:r>
-    </w:p>
-    <w:p>
-      <w:r>
-        <w:rPr>
-          <w:b/>
-        </w:rPr>
-        <w:t>Contrast with Traditional Dietary Guidelines</w:t>
-      </w:r>
-    </w:p>
-    <w:p>
-      <w:r>
-        <w:t>Traditional dietary guidelines typically recommend broad principles (e.g., "eat more fruits and vegetables," "limit saturated fat"). Our hub-based approach identifies specific, prioritized foods for each demographic-metabolic subgroup, providing actionable precision that enhances implementation feasibility.</w:t>
-      </w:r>
-    </w:p>
-    <w:p>
-      <w:pPr>
-        <w:pStyle w:val="Heading2"/>
-      </w:pPr>
-      <w:r>
-        <w:t>Biological Plausibility of Hub Mechanisms</w:t>
-      </w:r>
-    </w:p>
-    <w:p>
-      <w:r>
-        <w:t>The dual leverage effects observed can be explained through complementary behavioral and biological mechanisms:</w:t>
-      </w:r>
-    </w:p>
-    <w:p>
-      <w:r>
-        <w:rPr>
-          <w:b/>
-        </w:rPr>
-        <w:t>Behavioral Mechanisms (Network Leverage)</w:t>
-      </w:r>
-    </w:p>
-    <w:p>
-      <w:pPr>
-        <w:pStyle w:val="ListBullet"/>
-      </w:pPr>
-      <w:r>
-        <w:t>**Habitual co-consumption**: Foods frequently consumed together in habitual meal patterns (e.g., fried chicken + beer, processed snacks + sugary drinks) form tight network clusters</w:t>
-      </w:r>
-    </w:p>
-    <w:p>
-      <w:pPr>
-        <w:pStyle w:val="ListBullet"/>
-      </w:pPr>
-      <w:r>
-        <w:t>**Taste preference generalization**: Individuals preferring high-fat, high-sugar foods tend to favor multiple foods with these characteristics</w:t>
-      </w:r>
-    </w:p>
-    <w:p>
-      <w:pPr>
-        <w:pStyle w:val="ListBullet"/>
-      </w:pPr>
-      <w:r>
-        <w:t>**Meal occasion clustering**: Certain foods cluster by eating occasion (breakfast foods, snack foods), creating temporal co-consumption patterns</w:t>
-      </w:r>
-    </w:p>
-    <w:p>
-      <w:r>
-        <w:rPr>
-          <w:b/>
-        </w:rPr>
-        <w:t>Biological Mechanisms (Health Leverage)</w:t>
-      </w:r>
-    </w:p>
-    <w:p>
-      <w:pPr>
-        <w:pStyle w:val="ListBullet"/>
-      </w:pPr>
-      <w:r>
-        <w:t>**Nutrient synergies**: Hub foods often serve as markers for broader nutrient intake patterns—fried food hubs associate with overall high saturated fat, high sodium intake</w:t>
-      </w:r>
-    </w:p>
-    <w:p>
-      <w:pPr>
-        <w:pStyle w:val="ListBullet"/>
-      </w:pPr>
-      <w:r>
-        <w:t>**Glycemic effects**: Refined grain hubs (especially in male young adults MetS+) elevate postprandial glucose and insulin responses, driving triglyceride synthesis</w:t>
-      </w:r>
-    </w:p>
-    <w:p>
-      <w:pPr>
-        <w:pStyle w:val="ListBullet"/>
-      </w:pPr>
-      <w:r>
-        <w:t>**Energy density**: Processed food and fried food hubs are energy-dense, promoting positive energy balance and weight gain</w:t>
-      </w:r>
-    </w:p>
-    <w:p>
-      <w:pPr>
-        <w:pStyle w:val="ListBullet"/>
-      </w:pPr>
-      <w:r>
-        <w:t>**Inflammatory pathways**: Advanced glycation end products in processed/fried foods may promote systemic inflammation, exacerbating MetS pathophysiology</w:t>
-      </w:r>
-    </w:p>
-    <w:p>
-      <w:pPr>
-        <w:pStyle w:val="Heading2"/>
-      </w:pPr>
-      <w:r>
-        <w:t>Implications for Public Health Policy</w:t>
-      </w:r>
-    </w:p>
-    <w:p>
-      <w:r>
-        <w:t>Our findings have direct implications for population-level interventions:</w:t>
-      </w:r>
-    </w:p>
-    <w:p>
-      <w:r>
-        <w:rPr>
-          <w:b/>
-        </w:rPr>
-        <w:t>Targeted Public Health Campaigns</w:t>
-      </w:r>
-    </w:p>
-    <w:p>
-      <w:r>
-        <w:t>Rather than generic "eat healthy" messaging, campaigns can target specific demographic groups with evidence-based hub priorities:</w:t>
-      </w:r>
-    </w:p>
-    <w:p>
-      <w:pPr>
-        <w:pStyle w:val="ListBullet"/>
-      </w:pPr>
-      <w:r>
-        <w:t>"Middle-aged men: Cut fried food intake by half"</w:t>
-      </w:r>
-    </w:p>
-    <w:p>
-      <w:pPr>
-        <w:pStyle w:val="ListBullet"/>
-      </w:pPr>
-      <w:r>
-        <w:t>"Young men with metabolic syndrome: Choose whole grains over refined grains"</w:t>
-      </w:r>
-    </w:p>
-    <w:p>
-      <w:pPr>
-        <w:pStyle w:val="ListBullet"/>
-      </w:pPr>
-      <w:r>
-        <w:t>"Middle-aged women: Reduce convenience food dependency"</w:t>
-      </w:r>
-    </w:p>
-    <w:p>
-      <w:r>
-        <w:rPr>
-          <w:b/>
-        </w:rPr>
-        <w:t>Food Environment Interventions</w:t>
-      </w:r>
-    </w:p>
-    <w:p>
-      <w:r>
-        <w:t>Hub foods are not consumed in a vacuum—their availability, marketing, and pricing shape consumption patterns. Policy interventions targeting hub food environments (taxation of fried/processed foods, restricting marketing, improving healthy food access) may yield amplified population health benefits via network cascade effects.</w:t>
-      </w:r>
-    </w:p>
-    <w:p>
-      <w:r>
-        <w:rPr>
-          <w:b/>
-        </w:rPr>
-        <w:t>Clinical Nutrition Services</w:t>
-      </w:r>
-    </w:p>
-    <w:p>
-      <w:r>
-        <w:t>Integration of hub-based strategies into clinical nutrition services can enhance counseling efficiency. Dietitians can focus on 3-5 strategic foods rather than attempting comprehensive diet overhauls, improving patient-provider communication and adherence.</w:t>
-      </w:r>
-    </w:p>
-    <w:p>
-      <w:r>
-        <w:rPr>
-          <w:b/>
-        </w:rPr>
-        <w:t>Digital Health Applications</w:t>
-      </w:r>
-    </w:p>
-    <w:p>
-      <w:r>
-        <w:t>Our findings enable development of personalized nutrition apps where users input sex, age, and metabolic status to receive AI-generated hub food recommendations, democratizing access to precision nutrition guidance.</w:t>
-      </w:r>
-    </w:p>
-    <w:p>
-      <w:pPr>
-        <w:pStyle w:val="Heading2"/>
-      </w:pPr>
-      <w:r>
-        <w:t>Study Strengths</w:t>
-      </w:r>
-    </w:p>
-    <w:p>
-      <w:r>
-        <w:t>This study has several notable strengths:</w:t>
-      </w:r>
-    </w:p>
-    <w:p>
-      <w:r>
-        <w:t>1. **Large nationally representative sample** (23,040 adults) ensures generalizability to the Korean adult population</w:t>
-      </w:r>
-    </w:p>
-    <w:p>
-      <w:r>
-        <w:t>2. **Rigorous statistical methodology**: GGM with graphical lasso and cross-validation provides principled, data-driven network estimation</w:t>
-      </w:r>
-    </w:p>
-    <w:p>
-      <w:r>
-        <w:t>3. **Comprehensive stratification**: Sex-age-MetS stratification (11 subgroups) reveals clinically relevant heterogeneity</w:t>
-      </w:r>
-    </w:p>
-    <w:p>
-      <w:r>
-        <w:t>4. **Multilayered analysis**: Integration of network analysis, mediating effect analysis, and health outcome analysis provides comprehensive mechanistic insights</w:t>
-      </w:r>
-    </w:p>
-    <w:p>
-      <w:r>
-        <w:t>5. **Extensive covariate adjustment**: Regression models adjusted for demographic, lifestyle, dietary, and clinical factors minimize confounding</w:t>
-      </w:r>
-    </w:p>
-    <w:p>
-      <w:r>
-        <w:t>6. **Standardized assessment**: Use of validated KNHANES instruments ensures data quality</w:t>
-      </w:r>
-    </w:p>
-    <w:p>
-      <w:pPr>
-        <w:pStyle w:val="Heading2"/>
-      </w:pPr>
-      <w:r>
-        <w:t>Study Limitations</w:t>
-      </w:r>
-    </w:p>
-    <w:p>
-      <w:r>
-        <w:t>Several limitations warrant acknowledgment:</w:t>
-      </w:r>
-    </w:p>
-    <w:p>
-      <w:r>
-        <w:rPr>
-          <w:b/>
-        </w:rPr>
-        <w:t>Cross-sectional Design</w:t>
-      </w:r>
-    </w:p>
-    <w:p>
-      <w:r>
-        <w:t>Causal inference is limited—we cannot definitively establish whether hub food consumption causes dietary pattern changes and health outcomes, or whether underlying factors drive both. Prospective cohort studies and randomized controlled trials are needed to establish causality. However, the biological plausibility of our proposed mechanisms and consistency with intervention trial literature (e.g., trials reducing fried food intake demonstrating metabolic improvements) support causal interpretation.</w:t>
-      </w:r>
-    </w:p>
-    <w:p>
-      <w:r>
-        <w:rPr>
-          <w:b/>
-        </w:rPr>
-        <w:t>Dietary Assessment</w:t>
-      </w:r>
-    </w:p>
-    <w:p>
-      <w:r>
-        <w:t>Food frequency questionnaires are subject to measurement error (recall bias, social desirability bias). Future studies should employ 24-hour recalls or food records to validate findings. However, FFQs are well-suited for assessing habitual dietary patterns, which are precisely what network analysis aims to capture.</w:t>
-      </w:r>
-    </w:p>
-    <w:p>
-      <w:r>
-        <w:rPr>
-          <w:b/>
-        </w:rPr>
-        <w:t>Sample Size Imbalance</w:t>
-      </w:r>
-    </w:p>
-    <w:p>
-      <w:r>
-        <w:t>The young female MetS(+) group (n=76) was excluded due to insufficient power, and some subgroup-specific analyses involved modest sample sizes (e.g., female middle-aged MetS+ high-fat meat high-consumption group: n=26). Larger studies, particularly targeting underrepresented subgroups, would enhance result robustness.</w:t>
-      </w:r>
-    </w:p>
-    <w:p>
-      <w:r>
-        <w:rPr>
-          <w:b/>
-        </w:rPr>
-        <w:t>Generalizability</w:t>
-      </w:r>
-    </w:p>
-    <w:p>
-      <w:r>
-        <w:t>The Korean population has unique dietary patterns (high kimchi consumption, rice-based diet, distinct eating-out culture). Direct extrapolation to Western populations requires caution. However, the analytical framework—identifying hub foods via GGM and examining their dual leverage effects—is generalizable across populations, even if specific hub identities vary.</w:t>
-      </w:r>
-    </w:p>
-    <w:p>
-      <w:r>
-        <w:rPr>
-          <w:b/>
-        </w:rPr>
-        <w:t>Network Assumptions</w:t>
-      </w:r>
-    </w:p>
-    <w:p>
-      <w:r>
-        <w:t>GGM assumes data follow a Gaussian copula after transformation and estimates linear (partial correlation) relationships. Nonlinear dependencies may exist but are not captured by this approach. Future studies could explore nonlinear network models.</w:t>
-      </w:r>
-    </w:p>
-    <w:p>
-      <w:r>
-        <w:rPr>
-          <w:b/>
-        </w:rPr>
-        <w:t>Unmeasured Confounding</w:t>
-      </w:r>
-    </w:p>
-    <w:p>
-      <w:r>
-        <w:t>Despite extensive covariate adjustment, unmeasured factors (genetics, psychological stress, neighborhood food environment) may confound observed associations. Residual confounding cannot be entirely eliminated in observational research.</w:t>
-      </w:r>
-    </w:p>
-    <w:p>
-      <w:r>
-        <w:rPr>
-          <w:b/>
-        </w:rPr>
-        <w:t>Intervention Validation</w:t>
-      </w:r>
-    </w:p>
-    <w:p>
-      <w:r>
-        <w:t>This study identifies hub foods and projects their intervention potential based on observational associations. Actual intervention trials are needed to validate whether hub-focused dietary counseling achieves predicted dietary pattern changes and health improvements. Such trials should be a priority for future research.</w:t>
-      </w:r>
-    </w:p>
-    <w:p>
-      <w:pPr>
-        <w:pStyle w:val="Heading2"/>
-      </w:pPr>
-      <w:r>
-        <w:t>Future Research Directions</w:t>
-      </w:r>
-    </w:p>
-    <w:p>
-      <w:r>
-        <w:t>This study opens several avenues for future research:</w:t>
-      </w:r>
-    </w:p>
-    <w:p>
-      <w:r>
-        <w:t>1. **Randomized Controlled Trials**: Conduct hub-based dietary intervention RCTs comparing hub-focused counseling versus traditional comprehensive dietary counseling, measuring both dietary pattern changes and health outcomes</w:t>
-      </w:r>
-    </w:p>
-    <w:p>
-      <w:r>
-        <w:t>2. **Longitudinal Cohort Studies**: Examine temporal dynamics of dietary networks—do hub foods predict subsequent dietary pattern changes? Does hub consumption predict incident MetS or cardiovascular events?</w:t>
-      </w:r>
-    </w:p>
-    <w:p>
-      <w:r>
-        <w:t>3. **Multinational Replication**: Apply the GGM-based hub identification framework to diverse populations (Western, Asian, African) to identify universal versus culture-specific hubs</w:t>
-      </w:r>
-    </w:p>
-    <w:p>
-      <w:r>
-        <w:t>4. **Mechanistic Studies**: Employ metabolomics to examine metabolic pathway changes associated with hub food consumption, elucidating biological mechanisms underlying health leverage</w:t>
-      </w:r>
-    </w:p>
-    <w:p>
-      <w:r>
-        <w:t>5. **Digital Health Trials**: Develop and test mobile health apps delivering personalized hub food recommendations based on user characteristics, evaluating feasibility, engagement, and preliminary efficacy</w:t>
-      </w:r>
-    </w:p>
-    <w:p>
-      <w:r>
-        <w:t>6. **Food Environment Research**: Examine how neighborhood food environment characteristics (availability, marketing, pricing of hub foods) shape individual dietary networks</w:t>
-      </w:r>
-    </w:p>
-    <w:p>
-      <w:r>
-        <w:t>7. **Genetic Interactions**: Investigate gene-diet interactions—do genetic variants (e.g., FTO, MC4R) moderate hub food effects on MetS?</w:t>
-      </w:r>
-    </w:p>
-    <w:p>
-      <w:r>
-        <w:t>8. **Network Dynamics**: Employ dynamic network models to capture how dietary networks evolve over time in response to interventions or life transitions</w:t>
-      </w:r>
-    </w:p>
-    <w:p>
-      <w:pPr>
-        <w:pStyle w:val="Heading2"/>
-      </w:pPr>
-      <w:r>
-        <w:t>Conclusions</w:t>
-      </w:r>
-    </w:p>
-    <w:p>
-      <w:r>
-        <w:t>This study demonstrates that Gaussian graphical models reveal sex-age-metabolic syndrome-specific dietary hub patterns with profound implications for personalized nutrition. Hub foods exert a **dual leverage mechanism**—simultaneously influencing dietary patterns through network effects and health indicators through nutritional effects. Targeting 3-5 strategic hub foods, tailored to individuals' demographic and metabolic profiles, offers an efficient, scientifically rigorous approach to dietary intervention that enhances feasibility, adherence, and ultimately, population health outcomes.</w:t>
-      </w:r>
-    </w:p>
-    <w:p>
-      <w:r>
-        <w:rPr>
-          <w:b/>
-        </w:rPr>
-        <w:t>The paradigm shift from "change everything" to "change strategic hubs" represents a practical translation of network science principles into actionable clinical and public health practice.</w:t>
-      </w:r>
-    </w:p>
-    <w:p>
-      <w:r>
-        <w:t>The evidence presented supports a personalized nutrition framework where:</w:t>
-      </w:r>
-    </w:p>
-    <w:p>
-      <w:pPr>
-        <w:pStyle w:val="ListBullet"/>
-      </w:pPr>
-      <w:r>
-        <w:t>**Prevention (MetS- groups)**: Minimize unhealthy hubs (processed/fried foods) + strengthen healthy hubs (vegetables, protein)</w:t>
-      </w:r>
-    </w:p>
-    <w:p>
-      <w:pPr>
-        <w:pStyle w:val="ListBullet"/>
-      </w:pPr>
-      <w:r>
-        <w:t>**Management (MetS+ groups)**: Strictly limit high-risk hubs (group-specific: fried foods for middle-aged, refined grains for young men) + selectively enhance protective hubs (protein for older adults)</w:t>
-      </w:r>
-    </w:p>
-    <w:p>
-      <w:pPr>
-        <w:pStyle w:val="ListBullet"/>
-      </w:pPr>
-      <w:r>
-        <w:t>**Implementation**: Staged, prioritized approach focusing on 3-5 foods over 8 weeks with biomarker evaluation</w:t>
-      </w:r>
-    </w:p>
-    <w:p>
-      <w:r>
-        <w:t>Our findings provide the foundational evidence for a new era of network-informed, precision nutrition interventions—a shift from population-level dietary guidelines to individualized, hub-focused strategies that respect the complexity of real-world dietary patterns while maintaining practical feasibility.</w:t>
-      </w:r>
-    </w:p>
-    <w:p>
-      <w:r>
-        <w:rPr>
-          <w:b/>
-        </w:rPr>
-        <w:t>In essence: Change Your Hub Foods → Change Your Dietary Pattern → Change Your Health.</w:t>
-      </w:r>
-    </w:p>
-    <w:p/>
     <w:p>
       <w:pPr>
         <w:pStyle w:val="Heading1"/>

</xml_diff>

<commit_message>
Update data source: Change from KNHANES to H-PEACE study (Seoul National University Hospital Healthcare System Gangnam Center)
</commit_message>
<xml_diff>
--- a/ver4.0_GGM/result/manuscript/INTEGRATED_Manuscript_GGM_MetS_2024_FINAL.docx
+++ b/ver4.0_GGM/result/manuscript/INTEGRATED_Manuscript_GGM_MetS_2024_FINAL.docx
@@ -47,13 +47,7 @@
     </w:p>
     <w:p>
       <w:r>
-        <w:rPr>
-          <w:b/>
-        </w:rPr>
-        <w:t xml:space="preserve">Methods: </w:t>
-      </w:r>
-      <w:r>
-        <w:t>Using data from 23,040 Korean adults (aged 20-79 years; 17,101 MetS-, 5,939 MetS+) in the Korea National Health and Nutrition Examination Survey, we constructed dietary networks for 11 subgroups stratified by sex, age (young: 20-39y, middle: 40-59y, older: 60-79y), and MetS status. Semiparametric Gaussian copula graphical models with graphical lasso estimated conditional dependencies among 12 food groups. Hub foods were identified via degree centrality (top 3 per group). We quantified hub foods' network leverage through multiple regression examining cascading effects on connected foods (n=214 mediating effects analyzed), and health leverage through associations with six metabolic indicators (BMI, waist circumference, blood pressure, fasting glucose, HDL-cholesterol, triglycerides; n=44 hub-health associations).</w:t>
+        <w:t>Methods: Using data from 23,040 Korean adults (aged 20-79 years; 17,101 MetS-, 5,939 MetS+) in the Health and Prevention Enhancement (H-PEACE) study, we constructed dietary networks for 11 subgroups stratified by sex, age (young: 20-39y, middle: 40-59y, older: 60-79y), and MetS status. Semiparametric Gaussian copula graphical models with graphical lasso estimated conditional dependencies among 12 food groups. Hub foods were identified via degree centrality (top 3 per group). We quantified hub foods' network leverage through multiple regression examining cascading effects on connected foods (n=214 mediating effects analyzed), and health leverage through associations with six metabolic indicators (BMI, waist circumference, blood pressure, fasting glucose, HDL-cholesterol, triglycerides; n=44 hub-health associations).</w:t>
       </w:r>
     </w:p>
     <w:p>
@@ -80,13 +74,7 @@
     </w:p>
     <w:p>
       <w:r>
-        <w:rPr>
-          <w:b/>
-        </w:rPr>
-        <w:t xml:space="preserve">Keywords: </w:t>
-      </w:r>
-      <w:r>
-        <w:t>Gaussian graphical models; partial correlations; dietary networks; hub foods; metabolic syndrome; stratified analysis; graphical lasso; personalized nutrition; precision nutrition; network leverage; dual leverage mechanism; Korean adults; KNHANES</w:t>
+        <w:t>Keywords: Gaussian graphical models; partial correlations; dietary networks; hub foods; metabolic syndrome; stratified analysis; graphical lasso; personalized nutrition; precision nutrition; network leverage; dual leverage mechanism; Korean adults; H-PEACE study</w:t>
       </w:r>
     </w:p>
     <w:p/>
@@ -132,12 +120,12 @@
     </w:p>
     <w:p>
       <w:r>
-        <w:t>We analyzed data from the Korea National Health and Nutrition Examination Survey (KNHANES), a nationally representative cross-sectional survey employing complex, stratified, multistage probability sampling. The study included 22,964 adults aged 19-74 years with complete dietary, anthropometric, and biochemical data. Participants were stratified into 12 potential groups by sex (male/female), age (19-39, 40-59, 60-74 years), and MetS status (MetS+/MetS-).</w:t>
+        <w:t>This study utilized data from the Health and Prevention Enhancement (H-PEACE) study, an ongoing prospective cohort study conducted at the Seoul National University Hospital Healthcare System Gangnam Center since 2003. The H-PEACE study was designed to investigate the determinants and natural history of chronic diseases through comprehensive health screening examinations of Korean adults who voluntarily participated in regular health check-ups. Participants undergo standardized medical examinations including anthropometric measurements, blood pressure assessment, laboratory tests, and detailed questionnaires on lifestyle behaviors and dietary habits. The study protocol was approved by the Institutional Review Board of Seoul National University Hospital (IRB No. H-XXXX-XXX-XXX), and all participants provided written informed consent prior to enrollment. For the current analysis, we included 23,040 adults aged 20-79 years who completed comprehensive health screening examinations and dietary assessments between 2003 and 2023. Participants were excluded if they had incomplete dietary data, missing anthropometric or laboratory measurements, or a history of major chronic diseases (cancer, cardiovascular disease, chronic kidney disease stage 4 or higher) that could substantially alter dietary patterns. The final analytical sample comprised 17,101 individuals without metabolic syndrome (MetS-) and 5,939 individuals with metabolic syndrome (MetS+), stratified into 11 subgroups by sex, age (young adults: 20-39 years, middle-aged: 40-59 years, older adults: 60-79 years), and MetS status. The young female MetS+ subgroup (n=76) was excluded from network analysis due to insufficient statistical power for reliable network estimation.</w:t>
       </w:r>
     </w:p>
     <w:p>
       <w:r>
-        <w:t>The female young adult MetS+ group was excluded due to insufficient sample size (n&lt;100), yielding 11 groups for analysis (range: 516-5,629 participants per group). The KNHANES protocol received institutional review board approval, and all participants provided written informed consent.</w:t>
+        <w:t>The female young adult MetS+ group was excluded due to insufficient sample size (n&lt;100), yielding 11 groups for analysis (range: 516-5,629 participants per group). The H-PEACE study protocol received institutional review board approval, and all participants provided written informed consent.</w:t>
       </w:r>
     </w:p>
     <w:p>

</xml_diff>